<commit_message>
docs: close the hr_db schema gap in the SRS (Section 9.3.6)
Adds the date/approver columns hr-service's build was missing and had
flagged rather than silently invent (CLAUDE.md rule 5):

- transfers: + requested_at, effective_date, approved_by
- promotions: + effective_date, approved_by (now NOT NULL)
- leave_requests: + start_date, end_date (NOT NULL), approved_by
- discipline_records: + incident_date, description, outcome
- performance_reviews: + comments

hr-service's current migrations/models/schemas/openapi.yaml predate this and
don't yet carry these columns — follow-up work, not done here.

Co-Authored-By: Claude Sonnet 5 <noreply@anthropic.com>
Claude-Session: https://claude.ai/code/session_01MQGMqTxhwAaygiM4ahbos4
</commit_message>
<xml_diff>
--- a/scaffold/docs/PMP_SRS_Database_Design.docx
+++ b/scaffold/docs/PMP_SRS_Database_Design.docx
@@ -29943,6 +29943,307 @@
                 <w:sz w:val="19"/>
                 <w:szCs w:val="19"/>
               </w:rPr>
+              <w:t xml:space="preserve">transfers.requested_at</w:t>
+            </w:r>
+          </w:p>
+        </w:tc>
+        <w:tc>
+          <w:tcPr>
+            <w:tcW w:type="dxa" w:w="1700"/>
+            <w:shd w:fill="F3F4F6" w:val="clear"/>
+            <w:tcMar>
+              <w:top w:type="dxa" w:w="60"/>
+              <w:left w:type="dxa" w:w="100"/>
+              <w:bottom w:type="dxa" w:w="60"/>
+              <w:right w:type="dxa" w:w="100"/>
+            </w:tcMar>
+            <w:vAlign w:val="center"/>
+          </w:tcPr>
+          <w:p>
+            <w:r>
+              <w:rPr>
+                <w:b w:val="false"/>
+                <w:bCs w:val="false"/>
+                <w:color w:val="111827"/>
+                <w:sz w:val="19"/>
+                <w:szCs w:val="19"/>
+              </w:rPr>
+              <w:t xml:space="preserve">TIMESTAMPTZ</w:t>
+            </w:r>
+          </w:p>
+        </w:tc>
+        <w:tc>
+          <w:tcPr>
+            <w:tcW w:type="dxa" w:w="2160"/>
+            <w:shd w:fill="F3F4F6" w:val="clear"/>
+            <w:tcMar>
+              <w:top w:type="dxa" w:w="60"/>
+              <w:left w:type="dxa" w:w="100"/>
+              <w:bottom w:type="dxa" w:w="60"/>
+              <w:right w:type="dxa" w:w="100"/>
+            </w:tcMar>
+            <w:vAlign w:val="center"/>
+          </w:tcPr>
+          <w:p>
+            <w:r>
+              <w:rPr>
+                <w:b w:val="false"/>
+                <w:bCs w:val="false"/>
+                <w:color w:val="111827"/>
+                <w:sz w:val="19"/>
+                <w:szCs w:val="19"/>
+              </w:rPr>
+              <w:t xml:space="preserve">NOT NULL, DEFAULT now()</w:t>
+            </w:r>
+          </w:p>
+        </w:tc>
+        <w:tc>
+          <w:tcPr>
+            <w:tcW w:type="dxa" w:w="3800"/>
+            <w:shd w:fill="F3F4F6" w:val="clear"/>
+            <w:tcMar>
+              <w:top w:type="dxa" w:w="60"/>
+              <w:left w:type="dxa" w:w="100"/>
+              <w:bottom w:type="dxa" w:w="60"/>
+              <w:right w:type="dxa" w:w="100"/>
+            </w:tcMar>
+            <w:vAlign w:val="center"/>
+          </w:tcPr>
+          <w:p>
+            <w:r>
+              <w:rPr>
+                <w:b w:val="false"/>
+                <w:bCs w:val="false"/>
+                <w:color w:val="111827"/>
+                <w:sz w:val="19"/>
+                <w:szCs w:val="19"/>
+              </w:rPr>
+              <w:t xml:space="preserve">When the transfer was requested</w:t>
+            </w:r>
+          </w:p>
+        </w:tc>
+      </w:tr>
+      <w:tr>
+        <w:tc>
+          <w:tcPr>
+            <w:tcW w:type="dxa" w:w="1700"/>
+            <w:tcMar>
+              <w:top w:type="dxa" w:w="60"/>
+              <w:left w:type="dxa" w:w="100"/>
+              <w:bottom w:type="dxa" w:w="60"/>
+              <w:right w:type="dxa" w:w="100"/>
+            </w:tcMar>
+            <w:vAlign w:val="center"/>
+          </w:tcPr>
+          <w:p>
+            <w:r>
+              <w:rPr>
+                <w:b w:val="false"/>
+                <w:bCs w:val="false"/>
+                <w:color w:val="111827"/>
+                <w:sz w:val="19"/>
+                <w:szCs w:val="19"/>
+              </w:rPr>
+              <w:t xml:space="preserve">transfers.effective_date</w:t>
+            </w:r>
+          </w:p>
+        </w:tc>
+        <w:tc>
+          <w:tcPr>
+            <w:tcW w:type="dxa" w:w="1700"/>
+            <w:tcMar>
+              <w:top w:type="dxa" w:w="60"/>
+              <w:left w:type="dxa" w:w="100"/>
+              <w:bottom w:type="dxa" w:w="60"/>
+              <w:right w:type="dxa" w:w="100"/>
+            </w:tcMar>
+            <w:vAlign w:val="center"/>
+          </w:tcPr>
+          <w:p>
+            <w:r>
+              <w:rPr>
+                <w:b w:val="false"/>
+                <w:bCs w:val="false"/>
+                <w:color w:val="111827"/>
+                <w:sz w:val="19"/>
+                <w:szCs w:val="19"/>
+              </w:rPr>
+              <w:t xml:space="preserve">DATE</w:t>
+            </w:r>
+          </w:p>
+        </w:tc>
+        <w:tc>
+          <w:tcPr>
+            <w:tcW w:type="dxa" w:w="2160"/>
+            <w:tcMar>
+              <w:top w:type="dxa" w:w="60"/>
+              <w:left w:type="dxa" w:w="100"/>
+              <w:bottom w:type="dxa" w:w="60"/>
+              <w:right w:type="dxa" w:w="100"/>
+            </w:tcMar>
+            <w:vAlign w:val="center"/>
+          </w:tcPr>
+          <w:p>
+            <w:r>
+              <w:rPr>
+                <w:b w:val="false"/>
+                <w:bCs w:val="false"/>
+                <w:color w:val="111827"/>
+                <w:sz w:val="19"/>
+                <w:szCs w:val="19"/>
+              </w:rPr>
+              <w:t xml:space="preserve">NULLABLE</w:t>
+            </w:r>
+          </w:p>
+        </w:tc>
+        <w:tc>
+          <w:tcPr>
+            <w:tcW w:type="dxa" w:w="3800"/>
+            <w:tcMar>
+              <w:top w:type="dxa" w:w="60"/>
+              <w:left w:type="dxa" w:w="100"/>
+              <w:bottom w:type="dxa" w:w="60"/>
+              <w:right w:type="dxa" w:w="100"/>
+            </w:tcMar>
+            <w:vAlign w:val="center"/>
+          </w:tcPr>
+          <w:p>
+            <w:r>
+              <w:rPr>
+                <w:b w:val="false"/>
+                <w:bCs w:val="false"/>
+                <w:color w:val="111827"/>
+                <w:sz w:val="19"/>
+                <w:szCs w:val="19"/>
+              </w:rPr>
+              <w:t xml:space="preserve">Date the transfer takes effect once approved</w:t>
+            </w:r>
+          </w:p>
+        </w:tc>
+      </w:tr>
+      <w:tr>
+        <w:tc>
+          <w:tcPr>
+            <w:tcW w:type="dxa" w:w="1700"/>
+            <w:shd w:fill="F3F4F6" w:val="clear"/>
+            <w:tcMar>
+              <w:top w:type="dxa" w:w="60"/>
+              <w:left w:type="dxa" w:w="100"/>
+              <w:bottom w:type="dxa" w:w="60"/>
+              <w:right w:type="dxa" w:w="100"/>
+            </w:tcMar>
+            <w:vAlign w:val="center"/>
+          </w:tcPr>
+          <w:p>
+            <w:r>
+              <w:rPr>
+                <w:b w:val="false"/>
+                <w:bCs w:val="false"/>
+                <w:color w:val="111827"/>
+                <w:sz w:val="19"/>
+                <w:szCs w:val="19"/>
+              </w:rPr>
+              <w:t xml:space="preserve">transfers.approved_by</w:t>
+            </w:r>
+          </w:p>
+        </w:tc>
+        <w:tc>
+          <w:tcPr>
+            <w:tcW w:type="dxa" w:w="1700"/>
+            <w:shd w:fill="F3F4F6" w:val="clear"/>
+            <w:tcMar>
+              <w:top w:type="dxa" w:w="60"/>
+              <w:left w:type="dxa" w:w="100"/>
+              <w:bottom w:type="dxa" w:w="60"/>
+              <w:right w:type="dxa" w:w="100"/>
+            </w:tcMar>
+            <w:vAlign w:val="center"/>
+          </w:tcPr>
+          <w:p>
+            <w:r>
+              <w:rPr>
+                <w:b w:val="false"/>
+                <w:bCs w:val="false"/>
+                <w:color w:val="111827"/>
+                <w:sz w:val="19"/>
+                <w:szCs w:val="19"/>
+              </w:rPr>
+              <w:t xml:space="preserve">UUID</w:t>
+            </w:r>
+          </w:p>
+        </w:tc>
+        <w:tc>
+          <w:tcPr>
+            <w:tcW w:type="dxa" w:w="2160"/>
+            <w:shd w:fill="F3F4F6" w:val="clear"/>
+            <w:tcMar>
+              <w:top w:type="dxa" w:w="60"/>
+              <w:left w:type="dxa" w:w="100"/>
+              <w:bottom w:type="dxa" w:w="60"/>
+              <w:right w:type="dxa" w:w="100"/>
+            </w:tcMar>
+            <w:vAlign w:val="center"/>
+          </w:tcPr>
+          <w:p>
+            <w:r>
+              <w:rPr>
+                <w:b w:val="false"/>
+                <w:bCs w:val="false"/>
+                <w:color w:val="111827"/>
+                <w:sz w:val="19"/>
+                <w:szCs w:val="19"/>
+              </w:rPr>
+              <w:t xml:space="preserve">NULLABLE (logical FK → officers.id)</w:t>
+            </w:r>
+          </w:p>
+        </w:tc>
+        <w:tc>
+          <w:tcPr>
+            <w:tcW w:type="dxa" w:w="3800"/>
+            <w:shd w:fill="F3F4F6" w:val="clear"/>
+            <w:tcMar>
+              <w:top w:type="dxa" w:w="60"/>
+              <w:left w:type="dxa" w:w="100"/>
+              <w:bottom w:type="dxa" w:w="60"/>
+              <w:right w:type="dxa" w:w="100"/>
+            </w:tcMar>
+            <w:vAlign w:val="center"/>
+          </w:tcPr>
+          <w:p>
+            <w:r>
+              <w:rPr>
+                <w:b w:val="false"/>
+                <w:bCs w:val="false"/>
+                <w:color w:val="111827"/>
+                <w:sz w:val="19"/>
+                <w:szCs w:val="19"/>
+              </w:rPr>
+              <w:t xml:space="preserve">Approving officer, set on approval</w:t>
+            </w:r>
+          </w:p>
+        </w:tc>
+      </w:tr>
+      <w:tr>
+        <w:tc>
+          <w:tcPr>
+            <w:tcW w:type="dxa" w:w="1700"/>
+            <w:tcMar>
+              <w:top w:type="dxa" w:w="60"/>
+              <w:left w:type="dxa" w:w="100"/>
+              <w:bottom w:type="dxa" w:w="60"/>
+              <w:right w:type="dxa" w:w="100"/>
+            </w:tcMar>
+            <w:vAlign w:val="center"/>
+          </w:tcPr>
+          <w:p>
+            <w:r>
+              <w:rPr>
+                <w:b w:val="false"/>
+                <w:bCs w:val="false"/>
+                <w:color w:val="111827"/>
+                <w:sz w:val="19"/>
+                <w:szCs w:val="19"/>
+              </w:rPr>
               <w:t xml:space="preserve">promotions.id</w:t>
             </w:r>
           </w:p>
@@ -29950,7 +30251,6 @@
         <w:tc>
           <w:tcPr>
             <w:tcW w:type="dxa" w:w="1700"/>
-            <w:shd w:fill="F3F4F6" w:val="clear"/>
             <w:tcMar>
               <w:top w:type="dxa" w:w="60"/>
               <w:left w:type="dxa" w:w="100"/>
@@ -29975,7 +30275,6 @@
         <w:tc>
           <w:tcPr>
             <w:tcW w:type="dxa" w:w="2160"/>
-            <w:shd w:fill="F3F4F6" w:val="clear"/>
             <w:tcMar>
               <w:top w:type="dxa" w:w="60"/>
               <w:left w:type="dxa" w:w="100"/>
@@ -30000,7 +30299,6 @@
         <w:tc>
           <w:tcPr>
             <w:tcW w:type="dxa" w:w="3800"/>
-            <w:shd w:fill="F3F4F6" w:val="clear"/>
             <w:tcMar>
               <w:top w:type="dxa" w:w="60"/>
               <w:left w:type="dxa" w:w="100"/>
@@ -30027,6 +30325,7 @@
         <w:tc>
           <w:tcPr>
             <w:tcW w:type="dxa" w:w="1700"/>
+            <w:shd w:fill="F3F4F6" w:val="clear"/>
             <w:tcMar>
               <w:top w:type="dxa" w:w="60"/>
               <w:left w:type="dxa" w:w="100"/>
@@ -30051,6 +30350,7 @@
         <w:tc>
           <w:tcPr>
             <w:tcW w:type="dxa" w:w="1700"/>
+            <w:shd w:fill="F3F4F6" w:val="clear"/>
             <w:tcMar>
               <w:top w:type="dxa" w:w="60"/>
               <w:left w:type="dxa" w:w="100"/>
@@ -30075,6 +30375,7 @@
         <w:tc>
           <w:tcPr>
             <w:tcW w:type="dxa" w:w="2160"/>
+            <w:shd w:fill="F3F4F6" w:val="clear"/>
             <w:tcMar>
               <w:top w:type="dxa" w:w="60"/>
               <w:left w:type="dxa" w:w="100"/>
@@ -30099,6 +30400,7 @@
         <w:tc>
           <w:tcPr>
             <w:tcW w:type="dxa" w:w="3800"/>
+            <w:shd w:fill="F3F4F6" w:val="clear"/>
             <w:tcMar>
               <w:top w:type="dxa" w:w="60"/>
               <w:left w:type="dxa" w:w="100"/>
@@ -30125,7 +30427,6 @@
         <w:tc>
           <w:tcPr>
             <w:tcW w:type="dxa" w:w="1700"/>
-            <w:shd w:fill="F3F4F6" w:val="clear"/>
             <w:tcMar>
               <w:top w:type="dxa" w:w="60"/>
               <w:left w:type="dxa" w:w="100"/>
@@ -30150,7 +30451,6 @@
         <w:tc>
           <w:tcPr>
             <w:tcW w:type="dxa" w:w="1700"/>
-            <w:shd w:fill="F3F4F6" w:val="clear"/>
             <w:tcMar>
               <w:top w:type="dxa" w:w="60"/>
               <w:left w:type="dxa" w:w="100"/>
@@ -30175,7 +30475,6 @@
         <w:tc>
           <w:tcPr>
             <w:tcW w:type="dxa" w:w="2160"/>
-            <w:shd w:fill="F3F4F6" w:val="clear"/>
             <w:tcMar>
               <w:top w:type="dxa" w:w="60"/>
               <w:left w:type="dxa" w:w="100"/>
@@ -30200,7 +30499,6 @@
         <w:tc>
           <w:tcPr>
             <w:tcW w:type="dxa" w:w="3800"/>
-            <w:shd w:fill="F3F4F6" w:val="clear"/>
             <w:tcMar>
               <w:top w:type="dxa" w:w="60"/>
               <w:left w:type="dxa" w:w="100"/>
@@ -30227,6 +30525,207 @@
         <w:tc>
           <w:tcPr>
             <w:tcW w:type="dxa" w:w="1700"/>
+            <w:shd w:fill="F3F4F6" w:val="clear"/>
+            <w:tcMar>
+              <w:top w:type="dxa" w:w="60"/>
+              <w:left w:type="dxa" w:w="100"/>
+              <w:bottom w:type="dxa" w:w="60"/>
+              <w:right w:type="dxa" w:w="100"/>
+            </w:tcMar>
+            <w:vAlign w:val="center"/>
+          </w:tcPr>
+          <w:p>
+            <w:r>
+              <w:rPr>
+                <w:b w:val="false"/>
+                <w:bCs w:val="false"/>
+                <w:color w:val="111827"/>
+                <w:sz w:val="19"/>
+                <w:szCs w:val="19"/>
+              </w:rPr>
+              <w:t xml:space="preserve">promotions.effective_date</w:t>
+            </w:r>
+          </w:p>
+        </w:tc>
+        <w:tc>
+          <w:tcPr>
+            <w:tcW w:type="dxa" w:w="1700"/>
+            <w:shd w:fill="F3F4F6" w:val="clear"/>
+            <w:tcMar>
+              <w:top w:type="dxa" w:w="60"/>
+              <w:left w:type="dxa" w:w="100"/>
+              <w:bottom w:type="dxa" w:w="60"/>
+              <w:right w:type="dxa" w:w="100"/>
+            </w:tcMar>
+            <w:vAlign w:val="center"/>
+          </w:tcPr>
+          <w:p>
+            <w:r>
+              <w:rPr>
+                <w:b w:val="false"/>
+                <w:bCs w:val="false"/>
+                <w:color w:val="111827"/>
+                <w:sz w:val="19"/>
+                <w:szCs w:val="19"/>
+              </w:rPr>
+              <w:t xml:space="preserve">DATE</w:t>
+            </w:r>
+          </w:p>
+        </w:tc>
+        <w:tc>
+          <w:tcPr>
+            <w:tcW w:type="dxa" w:w="2160"/>
+            <w:shd w:fill="F3F4F6" w:val="clear"/>
+            <w:tcMar>
+              <w:top w:type="dxa" w:w="60"/>
+              <w:left w:type="dxa" w:w="100"/>
+              <w:bottom w:type="dxa" w:w="60"/>
+              <w:right w:type="dxa" w:w="100"/>
+            </w:tcMar>
+            <w:vAlign w:val="center"/>
+          </w:tcPr>
+          <w:p>
+            <w:r>
+              <w:rPr>
+                <w:b w:val="false"/>
+                <w:bCs w:val="false"/>
+                <w:color w:val="111827"/>
+                <w:sz w:val="19"/>
+                <w:szCs w:val="19"/>
+              </w:rPr>
+              <w:t xml:space="preserve">NOT NULL</w:t>
+            </w:r>
+          </w:p>
+        </w:tc>
+        <w:tc>
+          <w:tcPr>
+            <w:tcW w:type="dxa" w:w="3800"/>
+            <w:shd w:fill="F3F4F6" w:val="clear"/>
+            <w:tcMar>
+              <w:top w:type="dxa" w:w="60"/>
+              <w:left w:type="dxa" w:w="100"/>
+              <w:bottom w:type="dxa" w:w="60"/>
+              <w:right w:type="dxa" w:w="100"/>
+            </w:tcMar>
+            <w:vAlign w:val="center"/>
+          </w:tcPr>
+          <w:p>
+            <w:r>
+              <w:rPr>
+                <w:b w:val="false"/>
+                <w:bCs w:val="false"/>
+                <w:color w:val="111827"/>
+                <w:sz w:val="19"/>
+                <w:szCs w:val="19"/>
+              </w:rPr>
+              <w:t xml:space="preserve">Date the new rank takes effect</w:t>
+            </w:r>
+          </w:p>
+        </w:tc>
+      </w:tr>
+      <w:tr>
+        <w:tc>
+          <w:tcPr>
+            <w:tcW w:type="dxa" w:w="1700"/>
+            <w:tcMar>
+              <w:top w:type="dxa" w:w="60"/>
+              <w:left w:type="dxa" w:w="100"/>
+              <w:bottom w:type="dxa" w:w="60"/>
+              <w:right w:type="dxa" w:w="100"/>
+            </w:tcMar>
+            <w:vAlign w:val="center"/>
+          </w:tcPr>
+          <w:p>
+            <w:r>
+              <w:rPr>
+                <w:b w:val="false"/>
+                <w:bCs w:val="false"/>
+                <w:color w:val="111827"/>
+                <w:sz w:val="19"/>
+                <w:szCs w:val="19"/>
+              </w:rPr>
+              <w:t xml:space="preserve">promotions.approved_by</w:t>
+            </w:r>
+          </w:p>
+        </w:tc>
+        <w:tc>
+          <w:tcPr>
+            <w:tcW w:type="dxa" w:w="1700"/>
+            <w:tcMar>
+              <w:top w:type="dxa" w:w="60"/>
+              <w:left w:type="dxa" w:w="100"/>
+              <w:bottom w:type="dxa" w:w="60"/>
+              <w:right w:type="dxa" w:w="100"/>
+            </w:tcMar>
+            <w:vAlign w:val="center"/>
+          </w:tcPr>
+          <w:p>
+            <w:r>
+              <w:rPr>
+                <w:b w:val="false"/>
+                <w:bCs w:val="false"/>
+                <w:color w:val="111827"/>
+                <w:sz w:val="19"/>
+                <w:szCs w:val="19"/>
+              </w:rPr>
+              <w:t xml:space="preserve">UUID</w:t>
+            </w:r>
+          </w:p>
+        </w:tc>
+        <w:tc>
+          <w:tcPr>
+            <w:tcW w:type="dxa" w:w="2160"/>
+            <w:tcMar>
+              <w:top w:type="dxa" w:w="60"/>
+              <w:left w:type="dxa" w:w="100"/>
+              <w:bottom w:type="dxa" w:w="60"/>
+              <w:right w:type="dxa" w:w="100"/>
+            </w:tcMar>
+            <w:vAlign w:val="center"/>
+          </w:tcPr>
+          <w:p>
+            <w:r>
+              <w:rPr>
+                <w:b w:val="false"/>
+                <w:bCs w:val="false"/>
+                <w:color w:val="111827"/>
+                <w:sz w:val="19"/>
+                <w:szCs w:val="19"/>
+              </w:rPr>
+              <w:t xml:space="preserve">NOT NULL (logical FK → officers.id)</w:t>
+            </w:r>
+          </w:p>
+        </w:tc>
+        <w:tc>
+          <w:tcPr>
+            <w:tcW w:type="dxa" w:w="3800"/>
+            <w:tcMar>
+              <w:top w:type="dxa" w:w="60"/>
+              <w:left w:type="dxa" w:w="100"/>
+              <w:bottom w:type="dxa" w:w="60"/>
+              <w:right w:type="dxa" w:w="100"/>
+            </w:tcMar>
+            <w:vAlign w:val="center"/>
+          </w:tcPr>
+          <w:p>
+            <w:r>
+              <w:rPr>
+                <w:b w:val="false"/>
+                <w:bCs w:val="false"/>
+                <w:color w:val="111827"/>
+                <w:sz w:val="19"/>
+                <w:szCs w:val="19"/>
+              </w:rPr>
+              <w:t xml:space="preserve">Approving officer</w:t>
+            </w:r>
+          </w:p>
+        </w:tc>
+      </w:tr>
+      <w:tr>
+        <w:tc>
+          <w:tcPr>
+            <w:tcW w:type="dxa" w:w="1700"/>
+            <w:shd w:fill="F3F4F6" w:val="clear"/>
             <w:tcMar>
               <w:top w:type="dxa" w:w="60"/>
               <w:left w:type="dxa" w:w="100"/>
@@ -30251,6 +30750,7 @@
         <w:tc>
           <w:tcPr>
             <w:tcW w:type="dxa" w:w="1700"/>
+            <w:shd w:fill="F3F4F6" w:val="clear"/>
             <w:tcMar>
               <w:top w:type="dxa" w:w="60"/>
               <w:left w:type="dxa" w:w="100"/>
@@ -30275,6 +30775,7 @@
         <w:tc>
           <w:tcPr>
             <w:tcW w:type="dxa" w:w="2160"/>
+            <w:shd w:fill="F3F4F6" w:val="clear"/>
             <w:tcMar>
               <w:top w:type="dxa" w:w="60"/>
               <w:left w:type="dxa" w:w="100"/>
@@ -30299,6 +30800,7 @@
         <w:tc>
           <w:tcPr>
             <w:tcW w:type="dxa" w:w="3800"/>
+            <w:shd w:fill="F3F4F6" w:val="clear"/>
             <w:tcMar>
               <w:top w:type="dxa" w:w="60"/>
               <w:left w:type="dxa" w:w="100"/>
@@ -30325,7 +30827,6 @@
         <w:tc>
           <w:tcPr>
             <w:tcW w:type="dxa" w:w="1700"/>
-            <w:shd w:fill="F3F4F6" w:val="clear"/>
             <w:tcMar>
               <w:top w:type="dxa" w:w="60"/>
               <w:left w:type="dxa" w:w="100"/>
@@ -30350,7 +30851,6 @@
         <w:tc>
           <w:tcPr>
             <w:tcW w:type="dxa" w:w="1700"/>
-            <w:shd w:fill="F3F4F6" w:val="clear"/>
             <w:tcMar>
               <w:top w:type="dxa" w:w="60"/>
               <w:left w:type="dxa" w:w="100"/>
@@ -30375,7 +30875,6 @@
         <w:tc>
           <w:tcPr>
             <w:tcW w:type="dxa" w:w="2160"/>
-            <w:shd w:fill="F3F4F6" w:val="clear"/>
             <w:tcMar>
               <w:top w:type="dxa" w:w="60"/>
               <w:left w:type="dxa" w:w="100"/>
@@ -30400,7 +30899,6 @@
         <w:tc>
           <w:tcPr>
             <w:tcW w:type="dxa" w:w="3800"/>
-            <w:shd w:fill="F3F4F6" w:val="clear"/>
             <w:tcMar>
               <w:top w:type="dxa" w:w="60"/>
               <w:left w:type="dxa" w:w="100"/>
@@ -30427,6 +30925,7 @@
         <w:tc>
           <w:tcPr>
             <w:tcW w:type="dxa" w:w="1700"/>
+            <w:shd w:fill="F3F4F6" w:val="clear"/>
             <w:tcMar>
               <w:top w:type="dxa" w:w="60"/>
               <w:left w:type="dxa" w:w="100"/>
@@ -30451,6 +30950,7 @@
         <w:tc>
           <w:tcPr>
             <w:tcW w:type="dxa" w:w="1700"/>
+            <w:shd w:fill="F3F4F6" w:val="clear"/>
             <w:tcMar>
               <w:top w:type="dxa" w:w="60"/>
               <w:left w:type="dxa" w:w="100"/>
@@ -30475,6 +30975,7 @@
         <w:tc>
           <w:tcPr>
             <w:tcW w:type="dxa" w:w="2160"/>
+            <w:shd w:fill="F3F4F6" w:val="clear"/>
             <w:tcMar>
               <w:top w:type="dxa" w:w="60"/>
               <w:left w:type="dxa" w:w="100"/>
@@ -30499,6 +31000,7 @@
         <w:tc>
           <w:tcPr>
             <w:tcW w:type="dxa" w:w="3800"/>
+            <w:shd w:fill="F3F4F6" w:val="clear"/>
             <w:tcMar>
               <w:top w:type="dxa" w:w="60"/>
               <w:left w:type="dxa" w:w="100"/>
@@ -30525,6 +31027,104 @@
         <w:tc>
           <w:tcPr>
             <w:tcW w:type="dxa" w:w="1700"/>
+            <w:tcMar>
+              <w:top w:type="dxa" w:w="60"/>
+              <w:left w:type="dxa" w:w="100"/>
+              <w:bottom w:type="dxa" w:w="60"/>
+              <w:right w:type="dxa" w:w="100"/>
+            </w:tcMar>
+            <w:vAlign w:val="center"/>
+          </w:tcPr>
+          <w:p>
+            <w:r>
+              <w:rPr>
+                <w:b w:val="false"/>
+                <w:bCs w:val="false"/>
+                <w:color w:val="111827"/>
+                <w:sz w:val="19"/>
+                <w:szCs w:val="19"/>
+              </w:rPr>
+              <w:t xml:space="preserve">leave_requests.start_date / end_date</w:t>
+            </w:r>
+          </w:p>
+        </w:tc>
+        <w:tc>
+          <w:tcPr>
+            <w:tcW w:type="dxa" w:w="1700"/>
+            <w:tcMar>
+              <w:top w:type="dxa" w:w="60"/>
+              <w:left w:type="dxa" w:w="100"/>
+              <w:bottom w:type="dxa" w:w="60"/>
+              <w:right w:type="dxa" w:w="100"/>
+            </w:tcMar>
+            <w:vAlign w:val="center"/>
+          </w:tcPr>
+          <w:p>
+            <w:r>
+              <w:rPr>
+                <w:b w:val="false"/>
+                <w:bCs w:val="false"/>
+                <w:color w:val="111827"/>
+                <w:sz w:val="19"/>
+                <w:szCs w:val="19"/>
+              </w:rPr>
+              <w:t xml:space="preserve">DATE / DATE</w:t>
+            </w:r>
+          </w:p>
+        </w:tc>
+        <w:tc>
+          <w:tcPr>
+            <w:tcW w:type="dxa" w:w="2160"/>
+            <w:tcMar>
+              <w:top w:type="dxa" w:w="60"/>
+              <w:left w:type="dxa" w:w="100"/>
+              <w:bottom w:type="dxa" w:w="60"/>
+              <w:right w:type="dxa" w:w="100"/>
+            </w:tcMar>
+            <w:vAlign w:val="center"/>
+          </w:tcPr>
+          <w:p>
+            <w:r>
+              <w:rPr>
+                <w:b w:val="false"/>
+                <w:bCs w:val="false"/>
+                <w:color w:val="111827"/>
+                <w:sz w:val="19"/>
+                <w:szCs w:val="19"/>
+              </w:rPr>
+              <w:t xml:space="preserve">NOT NULL / NOT NULL</w:t>
+            </w:r>
+          </w:p>
+        </w:tc>
+        <w:tc>
+          <w:tcPr>
+            <w:tcW w:type="dxa" w:w="3800"/>
+            <w:tcMar>
+              <w:top w:type="dxa" w:w="60"/>
+              <w:left w:type="dxa" w:w="100"/>
+              <w:bottom w:type="dxa" w:w="60"/>
+              <w:right w:type="dxa" w:w="100"/>
+            </w:tcMar>
+            <w:vAlign w:val="center"/>
+          </w:tcPr>
+          <w:p>
+            <w:r>
+              <w:rPr>
+                <w:b w:val="false"/>
+                <w:bCs w:val="false"/>
+                <w:color w:val="111827"/>
+                <w:sz w:val="19"/>
+                <w:szCs w:val="19"/>
+              </w:rPr>
+              <w:t xml:space="preserve">Requested leave period</w:t>
+            </w:r>
+          </w:p>
+        </w:tc>
+      </w:tr>
+      <w:tr>
+        <w:tc>
+          <w:tcPr>
+            <w:tcW w:type="dxa" w:w="1700"/>
             <w:shd w:fill="F3F4F6" w:val="clear"/>
             <w:tcMar>
               <w:top w:type="dxa" w:w="60"/>
@@ -30644,6 +31244,105 @@
                 <w:sz w:val="19"/>
                 <w:szCs w:val="19"/>
               </w:rPr>
+              <w:t xml:space="preserve">leave_requests.approved_by</w:t>
+            </w:r>
+          </w:p>
+        </w:tc>
+        <w:tc>
+          <w:tcPr>
+            <w:tcW w:type="dxa" w:w="1700"/>
+            <w:tcMar>
+              <w:top w:type="dxa" w:w="60"/>
+              <w:left w:type="dxa" w:w="100"/>
+              <w:bottom w:type="dxa" w:w="60"/>
+              <w:right w:type="dxa" w:w="100"/>
+            </w:tcMar>
+            <w:vAlign w:val="center"/>
+          </w:tcPr>
+          <w:p>
+            <w:r>
+              <w:rPr>
+                <w:b w:val="false"/>
+                <w:bCs w:val="false"/>
+                <w:color w:val="111827"/>
+                <w:sz w:val="19"/>
+                <w:szCs w:val="19"/>
+              </w:rPr>
+              <w:t xml:space="preserve">UUID</w:t>
+            </w:r>
+          </w:p>
+        </w:tc>
+        <w:tc>
+          <w:tcPr>
+            <w:tcW w:type="dxa" w:w="2160"/>
+            <w:tcMar>
+              <w:top w:type="dxa" w:w="60"/>
+              <w:left w:type="dxa" w:w="100"/>
+              <w:bottom w:type="dxa" w:w="60"/>
+              <w:right w:type="dxa" w:w="100"/>
+            </w:tcMar>
+            <w:vAlign w:val="center"/>
+          </w:tcPr>
+          <w:p>
+            <w:r>
+              <w:rPr>
+                <w:b w:val="false"/>
+                <w:bCs w:val="false"/>
+                <w:color w:val="111827"/>
+                <w:sz w:val="19"/>
+                <w:szCs w:val="19"/>
+              </w:rPr>
+              <w:t xml:space="preserve">NULLABLE (logical FK → officers.id)</w:t>
+            </w:r>
+          </w:p>
+        </w:tc>
+        <w:tc>
+          <w:tcPr>
+            <w:tcW w:type="dxa" w:w="3800"/>
+            <w:tcMar>
+              <w:top w:type="dxa" w:w="60"/>
+              <w:left w:type="dxa" w:w="100"/>
+              <w:bottom w:type="dxa" w:w="60"/>
+              <w:right w:type="dxa" w:w="100"/>
+            </w:tcMar>
+            <w:vAlign w:val="center"/>
+          </w:tcPr>
+          <w:p>
+            <w:r>
+              <w:rPr>
+                <w:b w:val="false"/>
+                <w:bCs w:val="false"/>
+                <w:color w:val="111827"/>
+                <w:sz w:val="19"/>
+                <w:szCs w:val="19"/>
+              </w:rPr>
+              <w:t xml:space="preserve">Approving officer, set on approval</w:t>
+            </w:r>
+          </w:p>
+        </w:tc>
+      </w:tr>
+      <w:tr>
+        <w:tc>
+          <w:tcPr>
+            <w:tcW w:type="dxa" w:w="1700"/>
+            <w:shd w:fill="F3F4F6" w:val="clear"/>
+            <w:tcMar>
+              <w:top w:type="dxa" w:w="60"/>
+              <w:left w:type="dxa" w:w="100"/>
+              <w:bottom w:type="dxa" w:w="60"/>
+              <w:right w:type="dxa" w:w="100"/>
+            </w:tcMar>
+            <w:vAlign w:val="center"/>
+          </w:tcPr>
+          <w:p>
+            <w:r>
+              <w:rPr>
+                <w:b w:val="false"/>
+                <w:bCs w:val="false"/>
+                <w:color w:val="111827"/>
+                <w:sz w:val="19"/>
+                <w:szCs w:val="19"/>
+              </w:rPr>
               <w:t xml:space="preserve">discipline_records.id</w:t>
             </w:r>
           </w:p>
@@ -30651,6 +31350,7 @@
         <w:tc>
           <w:tcPr>
             <w:tcW w:type="dxa" w:w="1700"/>
+            <w:shd w:fill="F3F4F6" w:val="clear"/>
             <w:tcMar>
               <w:top w:type="dxa" w:w="60"/>
               <w:left w:type="dxa" w:w="100"/>
@@ -30675,6 +31375,7 @@
         <w:tc>
           <w:tcPr>
             <w:tcW w:type="dxa" w:w="2160"/>
+            <w:shd w:fill="F3F4F6" w:val="clear"/>
             <w:tcMar>
               <w:top w:type="dxa" w:w="60"/>
               <w:left w:type="dxa" w:w="100"/>
@@ -30699,6 +31400,7 @@
         <w:tc>
           <w:tcPr>
             <w:tcW w:type="dxa" w:w="3800"/>
+            <w:shd w:fill="F3F4F6" w:val="clear"/>
             <w:tcMar>
               <w:top w:type="dxa" w:w="60"/>
               <w:left w:type="dxa" w:w="100"/>
@@ -30725,7 +31427,6 @@
         <w:tc>
           <w:tcPr>
             <w:tcW w:type="dxa" w:w="1700"/>
-            <w:shd w:fill="F3F4F6" w:val="clear"/>
             <w:tcMar>
               <w:top w:type="dxa" w:w="60"/>
               <w:left w:type="dxa" w:w="100"/>
@@ -30750,7 +31451,6 @@
         <w:tc>
           <w:tcPr>
             <w:tcW w:type="dxa" w:w="1700"/>
-            <w:shd w:fill="F3F4F6" w:val="clear"/>
             <w:tcMar>
               <w:top w:type="dxa" w:w="60"/>
               <w:left w:type="dxa" w:w="100"/>
@@ -30775,7 +31475,6 @@
         <w:tc>
           <w:tcPr>
             <w:tcW w:type="dxa" w:w="2160"/>
-            <w:shd w:fill="F3F4F6" w:val="clear"/>
             <w:tcMar>
               <w:top w:type="dxa" w:w="60"/>
               <w:left w:type="dxa" w:w="100"/>
@@ -30800,7 +31499,6 @@
         <w:tc>
           <w:tcPr>
             <w:tcW w:type="dxa" w:w="3800"/>
-            <w:shd w:fill="F3F4F6" w:val="clear"/>
             <w:tcMar>
               <w:top w:type="dxa" w:w="60"/>
               <w:left w:type="dxa" w:w="100"/>
@@ -30827,6 +31525,308 @@
         <w:tc>
           <w:tcPr>
             <w:tcW w:type="dxa" w:w="1700"/>
+            <w:shd w:fill="F3F4F6" w:val="clear"/>
+            <w:tcMar>
+              <w:top w:type="dxa" w:w="60"/>
+              <w:left w:type="dxa" w:w="100"/>
+              <w:bottom w:type="dxa" w:w="60"/>
+              <w:right w:type="dxa" w:w="100"/>
+            </w:tcMar>
+            <w:vAlign w:val="center"/>
+          </w:tcPr>
+          <w:p>
+            <w:r>
+              <w:rPr>
+                <w:b w:val="false"/>
+                <w:bCs w:val="false"/>
+                <w:color w:val="111827"/>
+                <w:sz w:val="19"/>
+                <w:szCs w:val="19"/>
+              </w:rPr>
+              <w:t xml:space="preserve">discipline_records.incident_date</w:t>
+            </w:r>
+          </w:p>
+        </w:tc>
+        <w:tc>
+          <w:tcPr>
+            <w:tcW w:type="dxa" w:w="1700"/>
+            <w:shd w:fill="F3F4F6" w:val="clear"/>
+            <w:tcMar>
+              <w:top w:type="dxa" w:w="60"/>
+              <w:left w:type="dxa" w:w="100"/>
+              <w:bottom w:type="dxa" w:w="60"/>
+              <w:right w:type="dxa" w:w="100"/>
+            </w:tcMar>
+            <w:vAlign w:val="center"/>
+          </w:tcPr>
+          <w:p>
+            <w:r>
+              <w:rPr>
+                <w:b w:val="false"/>
+                <w:bCs w:val="false"/>
+                <w:color w:val="111827"/>
+                <w:sz w:val="19"/>
+                <w:szCs w:val="19"/>
+              </w:rPr>
+              <w:t xml:space="preserve">DATE</w:t>
+            </w:r>
+          </w:p>
+        </w:tc>
+        <w:tc>
+          <w:tcPr>
+            <w:tcW w:type="dxa" w:w="2160"/>
+            <w:shd w:fill="F3F4F6" w:val="clear"/>
+            <w:tcMar>
+              <w:top w:type="dxa" w:w="60"/>
+              <w:left w:type="dxa" w:w="100"/>
+              <w:bottom w:type="dxa" w:w="60"/>
+              <w:right w:type="dxa" w:w="100"/>
+            </w:tcMar>
+            <w:vAlign w:val="center"/>
+          </w:tcPr>
+          <w:p>
+            <w:r>
+              <w:rPr>
+                <w:b w:val="false"/>
+                <w:bCs w:val="false"/>
+                <w:color w:val="111827"/>
+                <w:sz w:val="19"/>
+                <w:szCs w:val="19"/>
+              </w:rPr>
+              <w:t xml:space="preserve">NOT NULL</w:t>
+            </w:r>
+          </w:p>
+        </w:tc>
+        <w:tc>
+          <w:tcPr>
+            <w:tcW w:type="dxa" w:w="3800"/>
+            <w:shd w:fill="F3F4F6" w:val="clear"/>
+            <w:tcMar>
+              <w:top w:type="dxa" w:w="60"/>
+              <w:left w:type="dxa" w:w="100"/>
+              <w:bottom w:type="dxa" w:w="60"/>
+              <w:right w:type="dxa" w:w="100"/>
+            </w:tcMar>
+            <w:vAlign w:val="center"/>
+          </w:tcPr>
+          <w:p>
+            <w:r>
+              <w:rPr>
+                <w:b w:val="false"/>
+                <w:bCs w:val="false"/>
+                <w:color w:val="111827"/>
+                <w:sz w:val="19"/>
+                <w:szCs w:val="19"/>
+              </w:rPr>
+              <w:t xml:space="preserve">Date of the underlying incident</w:t>
+            </w:r>
+          </w:p>
+        </w:tc>
+      </w:tr>
+      <w:tr>
+        <w:tc>
+          <w:tcPr>
+            <w:tcW w:type="dxa" w:w="1700"/>
+            <w:tcMar>
+              <w:top w:type="dxa" w:w="60"/>
+              <w:left w:type="dxa" w:w="100"/>
+              <w:bottom w:type="dxa" w:w="60"/>
+              <w:right w:type="dxa" w:w="100"/>
+            </w:tcMar>
+            <w:vAlign w:val="center"/>
+          </w:tcPr>
+          <w:p>
+            <w:r>
+              <w:rPr>
+                <w:b w:val="false"/>
+                <w:bCs w:val="false"/>
+                <w:color w:val="111827"/>
+                <w:sz w:val="19"/>
+                <w:szCs w:val="19"/>
+              </w:rPr>
+              <w:t xml:space="preserve">discipline_records.description</w:t>
+            </w:r>
+          </w:p>
+        </w:tc>
+        <w:tc>
+          <w:tcPr>
+            <w:tcW w:type="dxa" w:w="1700"/>
+            <w:tcMar>
+              <w:top w:type="dxa" w:w="60"/>
+              <w:left w:type="dxa" w:w="100"/>
+              <w:bottom w:type="dxa" w:w="60"/>
+              <w:right w:type="dxa" w:w="100"/>
+            </w:tcMar>
+            <w:vAlign w:val="center"/>
+          </w:tcPr>
+          <w:p>
+            <w:r>
+              <w:rPr>
+                <w:b w:val="false"/>
+                <w:bCs w:val="false"/>
+                <w:color w:val="111827"/>
+                <w:sz w:val="19"/>
+                <w:szCs w:val="19"/>
+              </w:rPr>
+              <w:t xml:space="preserve">TEXT</w:t>
+            </w:r>
+          </w:p>
+        </w:tc>
+        <w:tc>
+          <w:tcPr>
+            <w:tcW w:type="dxa" w:w="2160"/>
+            <w:tcMar>
+              <w:top w:type="dxa" w:w="60"/>
+              <w:left w:type="dxa" w:w="100"/>
+              <w:bottom w:type="dxa" w:w="60"/>
+              <w:right w:type="dxa" w:w="100"/>
+            </w:tcMar>
+            <w:vAlign w:val="center"/>
+          </w:tcPr>
+          <w:p>
+            <w:r>
+              <w:rPr>
+                <w:b w:val="false"/>
+                <w:bCs w:val="false"/>
+                <w:color w:val="111827"/>
+                <w:sz w:val="19"/>
+                <w:szCs w:val="19"/>
+              </w:rPr>
+              <w:t xml:space="preserve">NOT NULL</w:t>
+            </w:r>
+          </w:p>
+        </w:tc>
+        <w:tc>
+          <w:tcPr>
+            <w:tcW w:type="dxa" w:w="3800"/>
+            <w:tcMar>
+              <w:top w:type="dxa" w:w="60"/>
+              <w:left w:type="dxa" w:w="100"/>
+              <w:bottom w:type="dxa" w:w="60"/>
+              <w:right w:type="dxa" w:w="100"/>
+            </w:tcMar>
+            <w:vAlign w:val="center"/>
+          </w:tcPr>
+          <w:p>
+            <w:r>
+              <w:rPr>
+                <w:b w:val="false"/>
+                <w:bCs w:val="false"/>
+                <w:color w:val="111827"/>
+                <w:sz w:val="19"/>
+                <w:szCs w:val="19"/>
+              </w:rPr>
+              <w:t xml:space="preserve">Description of the incident and process followed</w:t>
+            </w:r>
+          </w:p>
+        </w:tc>
+      </w:tr>
+      <w:tr>
+        <w:tc>
+          <w:tcPr>
+            <w:tcW w:type="dxa" w:w="1700"/>
+            <w:shd w:fill="F3F4F6" w:val="clear"/>
+            <w:tcMar>
+              <w:top w:type="dxa" w:w="60"/>
+              <w:left w:type="dxa" w:w="100"/>
+              <w:bottom w:type="dxa" w:w="60"/>
+              <w:right w:type="dxa" w:w="100"/>
+            </w:tcMar>
+            <w:vAlign w:val="center"/>
+          </w:tcPr>
+          <w:p>
+            <w:r>
+              <w:rPr>
+                <w:b w:val="false"/>
+                <w:bCs w:val="false"/>
+                <w:color w:val="111827"/>
+                <w:sz w:val="19"/>
+                <w:szCs w:val="19"/>
+              </w:rPr>
+              <w:t xml:space="preserve">discipline_records.outcome</w:t>
+            </w:r>
+          </w:p>
+        </w:tc>
+        <w:tc>
+          <w:tcPr>
+            <w:tcW w:type="dxa" w:w="1700"/>
+            <w:shd w:fill="F3F4F6" w:val="clear"/>
+            <w:tcMar>
+              <w:top w:type="dxa" w:w="60"/>
+              <w:left w:type="dxa" w:w="100"/>
+              <w:bottom w:type="dxa" w:w="60"/>
+              <w:right w:type="dxa" w:w="100"/>
+            </w:tcMar>
+            <w:vAlign w:val="center"/>
+          </w:tcPr>
+          <w:p>
+            <w:r>
+              <w:rPr>
+                <w:b w:val="false"/>
+                <w:bCs w:val="false"/>
+                <w:color w:val="111827"/>
+                <w:sz w:val="19"/>
+                <w:szCs w:val="19"/>
+              </w:rPr>
+              <w:t xml:space="preserve">VARCHAR(100)</w:t>
+            </w:r>
+          </w:p>
+        </w:tc>
+        <w:tc>
+          <w:tcPr>
+            <w:tcW w:type="dxa" w:w="2160"/>
+            <w:shd w:fill="F3F4F6" w:val="clear"/>
+            <w:tcMar>
+              <w:top w:type="dxa" w:w="60"/>
+              <w:left w:type="dxa" w:w="100"/>
+              <w:bottom w:type="dxa" w:w="60"/>
+              <w:right w:type="dxa" w:w="100"/>
+            </w:tcMar>
+            <w:vAlign w:val="center"/>
+          </w:tcPr>
+          <w:p>
+            <w:r>
+              <w:rPr>
+                <w:b w:val="false"/>
+                <w:bCs w:val="false"/>
+                <w:color w:val="111827"/>
+                <w:sz w:val="19"/>
+                <w:szCs w:val="19"/>
+              </w:rPr>
+              <w:t xml:space="preserve">NULLABLE</w:t>
+            </w:r>
+          </w:p>
+        </w:tc>
+        <w:tc>
+          <w:tcPr>
+            <w:tcW w:type="dxa" w:w="3800"/>
+            <w:shd w:fill="F3F4F6" w:val="clear"/>
+            <w:tcMar>
+              <w:top w:type="dxa" w:w="60"/>
+              <w:left w:type="dxa" w:w="100"/>
+              <w:bottom w:type="dxa" w:w="60"/>
+              <w:right w:type="dxa" w:w="100"/>
+            </w:tcMar>
+            <w:vAlign w:val="center"/>
+          </w:tcPr>
+          <w:p>
+            <w:r>
+              <w:rPr>
+                <w:b w:val="false"/>
+                <w:bCs w:val="false"/>
+                <w:color w:val="111827"/>
+                <w:sz w:val="19"/>
+                <w:szCs w:val="19"/>
+              </w:rPr>
+              <w:t xml:space="preserve">Outcome once the process concludes</w:t>
+            </w:r>
+          </w:p>
+        </w:tc>
+      </w:tr>
+      <w:tr>
+        <w:tc>
+          <w:tcPr>
+            <w:tcW w:type="dxa" w:w="1700"/>
             <w:tcMar>
               <w:top w:type="dxa" w:w="60"/>
               <w:left w:type="dxa" w:w="100"/>
@@ -31219,6 +32219,104 @@
                 <w:szCs w:val="19"/>
               </w:rPr>
               <w:t xml:space="preserve">Review period and structured score</w:t>
+            </w:r>
+          </w:p>
+        </w:tc>
+      </w:tr>
+      <w:tr>
+        <w:tc>
+          <w:tcPr>
+            <w:tcW w:type="dxa" w:w="1700"/>
+            <w:tcMar>
+              <w:top w:type="dxa" w:w="60"/>
+              <w:left w:type="dxa" w:w="100"/>
+              <w:bottom w:type="dxa" w:w="60"/>
+              <w:right w:type="dxa" w:w="100"/>
+            </w:tcMar>
+            <w:vAlign w:val="center"/>
+          </w:tcPr>
+          <w:p>
+            <w:r>
+              <w:rPr>
+                <w:b w:val="false"/>
+                <w:bCs w:val="false"/>
+                <w:color w:val="111827"/>
+                <w:sz w:val="19"/>
+                <w:szCs w:val="19"/>
+              </w:rPr>
+              <w:t xml:space="preserve">performance_reviews.comments</w:t>
+            </w:r>
+          </w:p>
+        </w:tc>
+        <w:tc>
+          <w:tcPr>
+            <w:tcW w:type="dxa" w:w="1700"/>
+            <w:tcMar>
+              <w:top w:type="dxa" w:w="60"/>
+              <w:left w:type="dxa" w:w="100"/>
+              <w:bottom w:type="dxa" w:w="60"/>
+              <w:right w:type="dxa" w:w="100"/>
+            </w:tcMar>
+            <w:vAlign w:val="center"/>
+          </w:tcPr>
+          <w:p>
+            <w:r>
+              <w:rPr>
+                <w:b w:val="false"/>
+                <w:bCs w:val="false"/>
+                <w:color w:val="111827"/>
+                <w:sz w:val="19"/>
+                <w:szCs w:val="19"/>
+              </w:rPr>
+              <w:t xml:space="preserve">TEXT</w:t>
+            </w:r>
+          </w:p>
+        </w:tc>
+        <w:tc>
+          <w:tcPr>
+            <w:tcW w:type="dxa" w:w="2160"/>
+            <w:tcMar>
+              <w:top w:type="dxa" w:w="60"/>
+              <w:left w:type="dxa" w:w="100"/>
+              <w:bottom w:type="dxa" w:w="60"/>
+              <w:right w:type="dxa" w:w="100"/>
+            </w:tcMar>
+            <w:vAlign w:val="center"/>
+          </w:tcPr>
+          <w:p>
+            <w:r>
+              <w:rPr>
+                <w:b w:val="false"/>
+                <w:bCs w:val="false"/>
+                <w:color w:val="111827"/>
+                <w:sz w:val="19"/>
+                <w:szCs w:val="19"/>
+              </w:rPr>
+              <w:t xml:space="preserve">NULLABLE</w:t>
+            </w:r>
+          </w:p>
+        </w:tc>
+        <w:tc>
+          <w:tcPr>
+            <w:tcW w:type="dxa" w:w="3800"/>
+            <w:tcMar>
+              <w:top w:type="dxa" w:w="60"/>
+              <w:left w:type="dxa" w:w="100"/>
+              <w:bottom w:type="dxa" w:w="60"/>
+              <w:right w:type="dxa" w:w="100"/>
+            </w:tcMar>
+            <w:vAlign w:val="center"/>
+          </w:tcPr>
+          <w:p>
+            <w:r>
+              <w:rPr>
+                <w:b w:val="false"/>
+                <w:bCs w:val="false"/>
+                <w:color w:val="111827"/>
+                <w:sz w:val="19"/>
+                <w:szCs w:val="19"/>
+              </w:rPr>
+              <w:t xml:space="preserve">Reviewer's structured comments</w:t>
             </w:r>
           </w:p>
         </w:tc>

</xml_diff>

<commit_message>
docs: close community/hr/notification schema gaps in the SRS
§9.3.4 gains meetings.attendee_summary, concerns.description/raised_by,
follow_up_actions.description. §9.3.6 gains officers.supervisor_id (self-ref,
for FR-COMM-04 supervisor escalation). §9.3.8 gains notification_templates.
subject/body and a notification_preferences table (FR-NOTIF-02).

Co-Authored-By: Claude Sonnet 5 <noreply@anthropic.com>
Claude-Session: https://claude.ai/code/session_01MQGMqTxhwAaygiM4ahbos4
</commit_message>
<xml_diff>
--- a/scaffold/docs/PMP_SRS_Database_Design.docx
+++ b/scaffold/docs/PMP_SRS_Database_Design.docx
@@ -26155,6 +26155,107 @@
                 <w:sz w:val="19"/>
                 <w:szCs w:val="19"/>
               </w:rPr>
+              <w:t xml:space="preserve">meetings.attendee_summary</w:t>
+            </w:r>
+          </w:p>
+        </w:tc>
+        <w:tc>
+          <w:tcPr>
+            <w:tcW w:type="dxa" w:w="1700"/>
+            <w:shd w:fill="F3F4F6" w:val="clear"/>
+            <w:tcMar>
+              <w:top w:type="dxa" w:w="60"/>
+              <w:left w:type="dxa" w:w="100"/>
+              <w:bottom w:type="dxa" w:w="60"/>
+              <w:right w:type="dxa" w:w="100"/>
+            </w:tcMar>
+            <w:vAlign w:val="center"/>
+          </w:tcPr>
+          <w:p>
+            <w:r>
+              <w:rPr>
+                <w:b w:val="false"/>
+                <w:bCs w:val="false"/>
+                <w:color w:val="111827"/>
+                <w:sz w:val="19"/>
+                <w:szCs w:val="19"/>
+              </w:rPr>
+              <w:t xml:space="preserve">TEXT</w:t>
+            </w:r>
+          </w:p>
+        </w:tc>
+        <w:tc>
+          <w:tcPr>
+            <w:tcW w:type="dxa" w:w="2160"/>
+            <w:shd w:fill="F3F4F6" w:val="clear"/>
+            <w:tcMar>
+              <w:top w:type="dxa" w:w="60"/>
+              <w:left w:type="dxa" w:w="100"/>
+              <w:bottom w:type="dxa" w:w="60"/>
+              <w:right w:type="dxa" w:w="100"/>
+            </w:tcMar>
+            <w:vAlign w:val="center"/>
+          </w:tcPr>
+          <w:p>
+            <w:r>
+              <w:rPr>
+                <w:b w:val="false"/>
+                <w:bCs w:val="false"/>
+                <w:color w:val="111827"/>
+                <w:sz w:val="19"/>
+                <w:szCs w:val="19"/>
+              </w:rPr>
+              <w:t xml:space="preserve">NULLABLE</w:t>
+            </w:r>
+          </w:p>
+        </w:tc>
+        <w:tc>
+          <w:tcPr>
+            <w:tcW w:type="dxa" w:w="3800"/>
+            <w:shd w:fill="F3F4F6" w:val="clear"/>
+            <w:tcMar>
+              <w:top w:type="dxa" w:w="60"/>
+              <w:left w:type="dxa" w:w="100"/>
+              <w:bottom w:type="dxa" w:w="60"/>
+              <w:right w:type="dxa" w:w="100"/>
+            </w:tcMar>
+            <w:vAlign w:val="center"/>
+          </w:tcPr>
+          <w:p>
+            <w:r>
+              <w:rPr>
+                <w:b w:val="false"/>
+                <w:bCs w:val="false"/>
+                <w:color w:val="111827"/>
+                <w:sz w:val="19"/>
+                <w:szCs w:val="19"/>
+              </w:rPr>
+              <w:t xml:space="preserve">Summary of attendees/turnout discussed at the meeting</w:t>
+            </w:r>
+          </w:p>
+        </w:tc>
+      </w:tr>
+      <w:tr>
+        <w:tc>
+          <w:tcPr>
+            <w:tcW w:type="dxa" w:w="1700"/>
+            <w:tcMar>
+              <w:top w:type="dxa" w:w="60"/>
+              <w:left w:type="dxa" w:w="100"/>
+              <w:bottom w:type="dxa" w:w="60"/>
+              <w:right w:type="dxa" w:w="100"/>
+            </w:tcMar>
+            <w:vAlign w:val="center"/>
+          </w:tcPr>
+          <w:p>
+            <w:r>
+              <w:rPr>
+                <w:b w:val="false"/>
+                <w:bCs w:val="false"/>
+                <w:color w:val="111827"/>
+                <w:sz w:val="19"/>
+                <w:szCs w:val="19"/>
+              </w:rPr>
               <w:t xml:space="preserve">concerns.id</w:t>
             </w:r>
           </w:p>
@@ -26162,7 +26263,6 @@
         <w:tc>
           <w:tcPr>
             <w:tcW w:type="dxa" w:w="1700"/>
-            <w:shd w:fill="F3F4F6" w:val="clear"/>
             <w:tcMar>
               <w:top w:type="dxa" w:w="60"/>
               <w:left w:type="dxa" w:w="100"/>
@@ -26187,7 +26287,6 @@
         <w:tc>
           <w:tcPr>
             <w:tcW w:type="dxa" w:w="2160"/>
-            <w:shd w:fill="F3F4F6" w:val="clear"/>
             <w:tcMar>
               <w:top w:type="dxa" w:w="60"/>
               <w:left w:type="dxa" w:w="100"/>
@@ -26212,7 +26311,6 @@
         <w:tc>
           <w:tcPr>
             <w:tcW w:type="dxa" w:w="3800"/>
-            <w:shd w:fill="F3F4F6" w:val="clear"/>
             <w:tcMar>
               <w:top w:type="dxa" w:w="60"/>
               <w:left w:type="dxa" w:w="100"/>
@@ -26239,6 +26337,7 @@
         <w:tc>
           <w:tcPr>
             <w:tcW w:type="dxa" w:w="1700"/>
+            <w:shd w:fill="F3F4F6" w:val="clear"/>
             <w:tcMar>
               <w:top w:type="dxa" w:w="60"/>
               <w:left w:type="dxa" w:w="100"/>
@@ -26263,6 +26362,7 @@
         <w:tc>
           <w:tcPr>
             <w:tcW w:type="dxa" w:w="1700"/>
+            <w:shd w:fill="F3F4F6" w:val="clear"/>
             <w:tcMar>
               <w:top w:type="dxa" w:w="60"/>
               <w:left w:type="dxa" w:w="100"/>
@@ -26287,6 +26387,7 @@
         <w:tc>
           <w:tcPr>
             <w:tcW w:type="dxa" w:w="2160"/>
+            <w:shd w:fill="F3F4F6" w:val="clear"/>
             <w:tcMar>
               <w:top w:type="dxa" w:w="60"/>
               <w:left w:type="dxa" w:w="100"/>
@@ -26311,6 +26412,7 @@
         <w:tc>
           <w:tcPr>
             <w:tcW w:type="dxa" w:w="3800"/>
+            <w:shd w:fill="F3F4F6" w:val="clear"/>
             <w:tcMar>
               <w:top w:type="dxa" w:w="60"/>
               <w:left w:type="dxa" w:w="100"/>
@@ -26337,7 +26439,6 @@
         <w:tc>
           <w:tcPr>
             <w:tcW w:type="dxa" w:w="1700"/>
-            <w:shd w:fill="F3F4F6" w:val="clear"/>
             <w:tcMar>
               <w:top w:type="dxa" w:w="60"/>
               <w:left w:type="dxa" w:w="100"/>
@@ -26362,7 +26463,6 @@
         <w:tc>
           <w:tcPr>
             <w:tcW w:type="dxa" w:w="1700"/>
-            <w:shd w:fill="F3F4F6" w:val="clear"/>
             <w:tcMar>
               <w:top w:type="dxa" w:w="60"/>
               <w:left w:type="dxa" w:w="100"/>
@@ -26387,7 +26487,6 @@
         <w:tc>
           <w:tcPr>
             <w:tcW w:type="dxa" w:w="2160"/>
-            <w:shd w:fill="F3F4F6" w:val="clear"/>
             <w:tcMar>
               <w:top w:type="dxa" w:w="60"/>
               <w:left w:type="dxa" w:w="100"/>
@@ -26412,7 +26511,6 @@
         <w:tc>
           <w:tcPr>
             <w:tcW w:type="dxa" w:w="3800"/>
-            <w:shd w:fill="F3F4F6" w:val="clear"/>
             <w:tcMar>
               <w:top w:type="dxa" w:w="60"/>
               <w:left w:type="dxa" w:w="100"/>
@@ -26439,6 +26537,207 @@
         <w:tc>
           <w:tcPr>
             <w:tcW w:type="dxa" w:w="1700"/>
+            <w:shd w:fill="F3F4F6" w:val="clear"/>
+            <w:tcMar>
+              <w:top w:type="dxa" w:w="60"/>
+              <w:left w:type="dxa" w:w="100"/>
+              <w:bottom w:type="dxa" w:w="60"/>
+              <w:right w:type="dxa" w:w="100"/>
+            </w:tcMar>
+            <w:vAlign w:val="center"/>
+          </w:tcPr>
+          <w:p>
+            <w:r>
+              <w:rPr>
+                <w:b w:val="false"/>
+                <w:bCs w:val="false"/>
+                <w:color w:val="111827"/>
+                <w:sz w:val="19"/>
+                <w:szCs w:val="19"/>
+              </w:rPr>
+              <w:t xml:space="preserve">concerns.description</w:t>
+            </w:r>
+          </w:p>
+        </w:tc>
+        <w:tc>
+          <w:tcPr>
+            <w:tcW w:type="dxa" w:w="1700"/>
+            <w:shd w:fill="F3F4F6" w:val="clear"/>
+            <w:tcMar>
+              <w:top w:type="dxa" w:w="60"/>
+              <w:left w:type="dxa" w:w="100"/>
+              <w:bottom w:type="dxa" w:w="60"/>
+              <w:right w:type="dxa" w:w="100"/>
+            </w:tcMar>
+            <w:vAlign w:val="center"/>
+          </w:tcPr>
+          <w:p>
+            <w:r>
+              <w:rPr>
+                <w:b w:val="false"/>
+                <w:bCs w:val="false"/>
+                <w:color w:val="111827"/>
+                <w:sz w:val="19"/>
+                <w:szCs w:val="19"/>
+              </w:rPr>
+              <w:t xml:space="preserve">TEXT</w:t>
+            </w:r>
+          </w:p>
+        </w:tc>
+        <w:tc>
+          <w:tcPr>
+            <w:tcW w:type="dxa" w:w="2160"/>
+            <w:shd w:fill="F3F4F6" w:val="clear"/>
+            <w:tcMar>
+              <w:top w:type="dxa" w:w="60"/>
+              <w:left w:type="dxa" w:w="100"/>
+              <w:bottom w:type="dxa" w:w="60"/>
+              <w:right w:type="dxa" w:w="100"/>
+            </w:tcMar>
+            <w:vAlign w:val="center"/>
+          </w:tcPr>
+          <w:p>
+            <w:r>
+              <w:rPr>
+                <w:b w:val="false"/>
+                <w:bCs w:val="false"/>
+                <w:color w:val="111827"/>
+                <w:sz w:val="19"/>
+                <w:szCs w:val="19"/>
+              </w:rPr>
+              <w:t xml:space="preserve">NOT NULL</w:t>
+            </w:r>
+          </w:p>
+        </w:tc>
+        <w:tc>
+          <w:tcPr>
+            <w:tcW w:type="dxa" w:w="3800"/>
+            <w:shd w:fill="F3F4F6" w:val="clear"/>
+            <w:tcMar>
+              <w:top w:type="dxa" w:w="60"/>
+              <w:left w:type="dxa" w:w="100"/>
+              <w:bottom w:type="dxa" w:w="60"/>
+              <w:right w:type="dxa" w:w="100"/>
+            </w:tcMar>
+            <w:vAlign w:val="center"/>
+          </w:tcPr>
+          <w:p>
+            <w:r>
+              <w:rPr>
+                <w:b w:val="false"/>
+                <w:bCs w:val="false"/>
+                <w:color w:val="111827"/>
+                <w:sz w:val="19"/>
+                <w:szCs w:val="19"/>
+              </w:rPr>
+              <w:t xml:space="preserve">Description of the concern raised</w:t>
+            </w:r>
+          </w:p>
+        </w:tc>
+      </w:tr>
+      <w:tr>
+        <w:tc>
+          <w:tcPr>
+            <w:tcW w:type="dxa" w:w="1700"/>
+            <w:tcMar>
+              <w:top w:type="dxa" w:w="60"/>
+              <w:left w:type="dxa" w:w="100"/>
+              <w:bottom w:type="dxa" w:w="60"/>
+              <w:right w:type="dxa" w:w="100"/>
+            </w:tcMar>
+            <w:vAlign w:val="center"/>
+          </w:tcPr>
+          <w:p>
+            <w:r>
+              <w:rPr>
+                <w:b w:val="false"/>
+                <w:bCs w:val="false"/>
+                <w:color w:val="111827"/>
+                <w:sz w:val="19"/>
+                <w:szCs w:val="19"/>
+              </w:rPr>
+              <w:t xml:space="preserve">concerns.raised_by</w:t>
+            </w:r>
+          </w:p>
+        </w:tc>
+        <w:tc>
+          <w:tcPr>
+            <w:tcW w:type="dxa" w:w="1700"/>
+            <w:tcMar>
+              <w:top w:type="dxa" w:w="60"/>
+              <w:left w:type="dxa" w:w="100"/>
+              <w:bottom w:type="dxa" w:w="60"/>
+              <w:right w:type="dxa" w:w="100"/>
+            </w:tcMar>
+            <w:vAlign w:val="center"/>
+          </w:tcPr>
+          <w:p>
+            <w:r>
+              <w:rPr>
+                <w:b w:val="false"/>
+                <w:bCs w:val="false"/>
+                <w:color w:val="111827"/>
+                <w:sz w:val="19"/>
+                <w:szCs w:val="19"/>
+              </w:rPr>
+              <w:t xml:space="preserve">VARCHAR(150)</w:t>
+            </w:r>
+          </w:p>
+        </w:tc>
+        <w:tc>
+          <w:tcPr>
+            <w:tcW w:type="dxa" w:w="2160"/>
+            <w:tcMar>
+              <w:top w:type="dxa" w:w="60"/>
+              <w:left w:type="dxa" w:w="100"/>
+              <w:bottom w:type="dxa" w:w="60"/>
+              <w:right w:type="dxa" w:w="100"/>
+            </w:tcMar>
+            <w:vAlign w:val="center"/>
+          </w:tcPr>
+          <w:p>
+            <w:r>
+              <w:rPr>
+                <w:b w:val="false"/>
+                <w:bCs w:val="false"/>
+                <w:color w:val="111827"/>
+                <w:sz w:val="19"/>
+                <w:szCs w:val="19"/>
+              </w:rPr>
+              <w:t xml:space="preserve">NULLABLE</w:t>
+            </w:r>
+          </w:p>
+        </w:tc>
+        <w:tc>
+          <w:tcPr>
+            <w:tcW w:type="dxa" w:w="3800"/>
+            <w:tcMar>
+              <w:top w:type="dxa" w:w="60"/>
+              <w:left w:type="dxa" w:w="100"/>
+              <w:bottom w:type="dxa" w:w="60"/>
+              <w:right w:type="dxa" w:w="100"/>
+            </w:tcMar>
+            <w:vAlign w:val="center"/>
+          </w:tcPr>
+          <w:p>
+            <w:r>
+              <w:rPr>
+                <w:b w:val="false"/>
+                <w:bCs w:val="false"/>
+                <w:color w:val="111827"/>
+                <w:sz w:val="19"/>
+                <w:szCs w:val="19"/>
+              </w:rPr>
+              <w:t xml:space="preserve">Name/identifier of the community member or party raising it (free text — not a system user)</w:t>
+            </w:r>
+          </w:p>
+        </w:tc>
+      </w:tr>
+      <w:tr>
+        <w:tc>
+          <w:tcPr>
+            <w:tcW w:type="dxa" w:w="1700"/>
+            <w:shd w:fill="F3F4F6" w:val="clear"/>
             <w:tcMar>
               <w:top w:type="dxa" w:w="60"/>
               <w:left w:type="dxa" w:w="100"/>
@@ -26463,6 +26762,7 @@
         <w:tc>
           <w:tcPr>
             <w:tcW w:type="dxa" w:w="1700"/>
+            <w:shd w:fill="F3F4F6" w:val="clear"/>
             <w:tcMar>
               <w:top w:type="dxa" w:w="60"/>
               <w:left w:type="dxa" w:w="100"/>
@@ -26487,6 +26787,7 @@
         <w:tc>
           <w:tcPr>
             <w:tcW w:type="dxa" w:w="2160"/>
+            <w:shd w:fill="F3F4F6" w:val="clear"/>
             <w:tcMar>
               <w:top w:type="dxa" w:w="60"/>
               <w:left w:type="dxa" w:w="100"/>
@@ -26511,6 +26812,7 @@
         <w:tc>
           <w:tcPr>
             <w:tcW w:type="dxa" w:w="3800"/>
+            <w:shd w:fill="F3F4F6" w:val="clear"/>
             <w:tcMar>
               <w:top w:type="dxa" w:w="60"/>
               <w:left w:type="dxa" w:w="100"/>
@@ -26537,7 +26839,6 @@
         <w:tc>
           <w:tcPr>
             <w:tcW w:type="dxa" w:w="1700"/>
-            <w:shd w:fill="F3F4F6" w:val="clear"/>
             <w:tcMar>
               <w:top w:type="dxa" w:w="60"/>
               <w:left w:type="dxa" w:w="100"/>
@@ -26562,7 +26863,6 @@
         <w:tc>
           <w:tcPr>
             <w:tcW w:type="dxa" w:w="1700"/>
-            <w:shd w:fill="F3F4F6" w:val="clear"/>
             <w:tcMar>
               <w:top w:type="dxa" w:w="60"/>
               <w:left w:type="dxa" w:w="100"/>
@@ -26587,7 +26887,6 @@
         <w:tc>
           <w:tcPr>
             <w:tcW w:type="dxa" w:w="2160"/>
-            <w:shd w:fill="F3F4F6" w:val="clear"/>
             <w:tcMar>
               <w:top w:type="dxa" w:w="60"/>
               <w:left w:type="dxa" w:w="100"/>
@@ -26612,7 +26911,6 @@
         <w:tc>
           <w:tcPr>
             <w:tcW w:type="dxa" w:w="3800"/>
-            <w:shd w:fill="F3F4F6" w:val="clear"/>
             <w:tcMar>
               <w:top w:type="dxa" w:w="60"/>
               <w:left w:type="dxa" w:w="100"/>
@@ -26639,6 +26937,7 @@
         <w:tc>
           <w:tcPr>
             <w:tcW w:type="dxa" w:w="1700"/>
+            <w:shd w:fill="F3F4F6" w:val="clear"/>
             <w:tcMar>
               <w:top w:type="dxa" w:w="60"/>
               <w:left w:type="dxa" w:w="100"/>
@@ -26663,6 +26962,7 @@
         <w:tc>
           <w:tcPr>
             <w:tcW w:type="dxa" w:w="1700"/>
+            <w:shd w:fill="F3F4F6" w:val="clear"/>
             <w:tcMar>
               <w:top w:type="dxa" w:w="60"/>
               <w:left w:type="dxa" w:w="100"/>
@@ -26687,6 +26987,7 @@
         <w:tc>
           <w:tcPr>
             <w:tcW w:type="dxa" w:w="2160"/>
+            <w:shd w:fill="F3F4F6" w:val="clear"/>
             <w:tcMar>
               <w:top w:type="dxa" w:w="60"/>
               <w:left w:type="dxa" w:w="100"/>
@@ -26711,6 +27012,7 @@
         <w:tc>
           <w:tcPr>
             <w:tcW w:type="dxa" w:w="3800"/>
+            <w:shd w:fill="F3F4F6" w:val="clear"/>
             <w:tcMar>
               <w:top w:type="dxa" w:w="60"/>
               <w:left w:type="dxa" w:w="100"/>
@@ -26729,6 +27031,104 @@
                 <w:szCs w:val="19"/>
               </w:rPr>
               <w:t xml:space="preserve">Related concern</w:t>
+            </w:r>
+          </w:p>
+        </w:tc>
+      </w:tr>
+      <w:tr>
+        <w:tc>
+          <w:tcPr>
+            <w:tcW w:type="dxa" w:w="1700"/>
+            <w:tcMar>
+              <w:top w:type="dxa" w:w="60"/>
+              <w:left w:type="dxa" w:w="100"/>
+              <w:bottom w:type="dxa" w:w="60"/>
+              <w:right w:type="dxa" w:w="100"/>
+            </w:tcMar>
+            <w:vAlign w:val="center"/>
+          </w:tcPr>
+          <w:p>
+            <w:r>
+              <w:rPr>
+                <w:b w:val="false"/>
+                <w:bCs w:val="false"/>
+                <w:color w:val="111827"/>
+                <w:sz w:val="19"/>
+                <w:szCs w:val="19"/>
+              </w:rPr>
+              <w:t xml:space="preserve">follow_up_actions.description</w:t>
+            </w:r>
+          </w:p>
+        </w:tc>
+        <w:tc>
+          <w:tcPr>
+            <w:tcW w:type="dxa" w:w="1700"/>
+            <w:tcMar>
+              <w:top w:type="dxa" w:w="60"/>
+              <w:left w:type="dxa" w:w="100"/>
+              <w:bottom w:type="dxa" w:w="60"/>
+              <w:right w:type="dxa" w:w="100"/>
+            </w:tcMar>
+            <w:vAlign w:val="center"/>
+          </w:tcPr>
+          <w:p>
+            <w:r>
+              <w:rPr>
+                <w:b w:val="false"/>
+                <w:bCs w:val="false"/>
+                <w:color w:val="111827"/>
+                <w:sz w:val="19"/>
+                <w:szCs w:val="19"/>
+              </w:rPr>
+              <w:t xml:space="preserve">TEXT</w:t>
+            </w:r>
+          </w:p>
+        </w:tc>
+        <w:tc>
+          <w:tcPr>
+            <w:tcW w:type="dxa" w:w="2160"/>
+            <w:tcMar>
+              <w:top w:type="dxa" w:w="60"/>
+              <w:left w:type="dxa" w:w="100"/>
+              <w:bottom w:type="dxa" w:w="60"/>
+              <w:right w:type="dxa" w:w="100"/>
+            </w:tcMar>
+            <w:vAlign w:val="center"/>
+          </w:tcPr>
+          <w:p>
+            <w:r>
+              <w:rPr>
+                <w:b w:val="false"/>
+                <w:bCs w:val="false"/>
+                <w:color w:val="111827"/>
+                <w:sz w:val="19"/>
+                <w:szCs w:val="19"/>
+              </w:rPr>
+              <w:t xml:space="preserve">NOT NULL</w:t>
+            </w:r>
+          </w:p>
+        </w:tc>
+        <w:tc>
+          <w:tcPr>
+            <w:tcW w:type="dxa" w:w="3800"/>
+            <w:tcMar>
+              <w:top w:type="dxa" w:w="60"/>
+              <w:left w:type="dxa" w:w="100"/>
+              <w:bottom w:type="dxa" w:w="60"/>
+              <w:right w:type="dxa" w:w="100"/>
+            </w:tcMar>
+            <w:vAlign w:val="center"/>
+          </w:tcPr>
+          <w:p>
+            <w:r>
+              <w:rPr>
+                <w:b w:val="false"/>
+                <w:bCs w:val="false"/>
+                <w:color w:val="111827"/>
+                <w:sz w:val="19"/>
+                <w:szCs w:val="19"/>
+              </w:rPr>
+              <w:t xml:space="preserve">Description of the action to be taken</w:t>
             </w:r>
           </w:p>
         </w:tc>
@@ -29044,6 +29444,105 @@
                 <w:sz w:val="19"/>
                 <w:szCs w:val="19"/>
               </w:rPr>
+              <w:t xml:space="preserve">officers.supervisor_id</w:t>
+            </w:r>
+          </w:p>
+        </w:tc>
+        <w:tc>
+          <w:tcPr>
+            <w:tcW w:type="dxa" w:w="1700"/>
+            <w:tcMar>
+              <w:top w:type="dxa" w:w="60"/>
+              <w:left w:type="dxa" w:w="100"/>
+              <w:bottom w:type="dxa" w:w="60"/>
+              <w:right w:type="dxa" w:w="100"/>
+            </w:tcMar>
+            <w:vAlign w:val="center"/>
+          </w:tcPr>
+          <w:p>
+            <w:r>
+              <w:rPr>
+                <w:b w:val="false"/>
+                <w:bCs w:val="false"/>
+                <w:color w:val="111827"/>
+                <w:sz w:val="19"/>
+                <w:szCs w:val="19"/>
+              </w:rPr>
+              <w:t xml:space="preserve">UUID</w:t>
+            </w:r>
+          </w:p>
+        </w:tc>
+        <w:tc>
+          <w:tcPr>
+            <w:tcW w:type="dxa" w:w="2160"/>
+            <w:tcMar>
+              <w:top w:type="dxa" w:w="60"/>
+              <w:left w:type="dxa" w:w="100"/>
+              <w:bottom w:type="dxa" w:w="60"/>
+              <w:right w:type="dxa" w:w="100"/>
+            </w:tcMar>
+            <w:vAlign w:val="center"/>
+          </w:tcPr>
+          <w:p>
+            <w:r>
+              <w:rPr>
+                <w:b w:val="false"/>
+                <w:bCs w:val="false"/>
+                <w:color w:val="111827"/>
+                <w:sz w:val="19"/>
+                <w:szCs w:val="19"/>
+              </w:rPr>
+              <w:t xml:space="preserve">NULLABLE (logical FK → officers.id)</w:t>
+            </w:r>
+          </w:p>
+        </w:tc>
+        <w:tc>
+          <w:tcPr>
+            <w:tcW w:type="dxa" w:w="3800"/>
+            <w:tcMar>
+              <w:top w:type="dxa" w:w="60"/>
+              <w:left w:type="dxa" w:w="100"/>
+              <w:bottom w:type="dxa" w:w="60"/>
+              <w:right w:type="dxa" w:w="100"/>
+            </w:tcMar>
+            <w:vAlign w:val="center"/>
+          </w:tcPr>
+          <w:p>
+            <w:r>
+              <w:rPr>
+                <w:b w:val="false"/>
+                <w:bCs w:val="false"/>
+                <w:color w:val="111827"/>
+                <w:sz w:val="19"/>
+                <w:szCs w:val="19"/>
+              </w:rPr>
+              <w:t xml:space="preserve">Direct supervisor — used for escalation/supervisor-notification requirements (e.g. FR-COMM-04)</w:t>
+            </w:r>
+          </w:p>
+        </w:tc>
+      </w:tr>
+      <w:tr>
+        <w:tc>
+          <w:tcPr>
+            <w:tcW w:type="dxa" w:w="1700"/>
+            <w:shd w:fill="F3F4F6" w:val="clear"/>
+            <w:tcMar>
+              <w:top w:type="dxa" w:w="60"/>
+              <w:left w:type="dxa" w:w="100"/>
+              <w:bottom w:type="dxa" w:w="60"/>
+              <w:right w:type="dxa" w:w="100"/>
+            </w:tcMar>
+            <w:vAlign w:val="center"/>
+          </w:tcPr>
+          <w:p>
+            <w:r>
+              <w:rPr>
+                <w:b w:val="false"/>
+                <w:bCs w:val="false"/>
+                <w:color w:val="111827"/>
+                <w:sz w:val="19"/>
+                <w:szCs w:val="19"/>
+              </w:rPr>
               <w:t xml:space="preserve">officers.status</w:t>
             </w:r>
           </w:p>
@@ -29051,6 +29550,7 @@
         <w:tc>
           <w:tcPr>
             <w:tcW w:type="dxa" w:w="1700"/>
+            <w:shd w:fill="F3F4F6" w:val="clear"/>
             <w:tcMar>
               <w:top w:type="dxa" w:w="60"/>
               <w:left w:type="dxa" w:w="100"/>
@@ -29075,6 +29575,7 @@
         <w:tc>
           <w:tcPr>
             <w:tcW w:type="dxa" w:w="2160"/>
+            <w:shd w:fill="F3F4F6" w:val="clear"/>
             <w:tcMar>
               <w:top w:type="dxa" w:w="60"/>
               <w:left w:type="dxa" w:w="100"/>
@@ -29099,6 +29600,7 @@
         <w:tc>
           <w:tcPr>
             <w:tcW w:type="dxa" w:w="3800"/>
+            <w:shd w:fill="F3F4F6" w:val="clear"/>
             <w:tcMar>
               <w:top w:type="dxa" w:w="60"/>
               <w:left w:type="dxa" w:w="100"/>
@@ -29125,7 +29627,6 @@
         <w:tc>
           <w:tcPr>
             <w:tcW w:type="dxa" w:w="1700"/>
-            <w:shd w:fill="F3F4F6" w:val="clear"/>
             <w:tcMar>
               <w:top w:type="dxa" w:w="60"/>
               <w:left w:type="dxa" w:w="100"/>
@@ -29150,7 +29651,6 @@
         <w:tc>
           <w:tcPr>
             <w:tcW w:type="dxa" w:w="1700"/>
-            <w:shd w:fill="F3F4F6" w:val="clear"/>
             <w:tcMar>
               <w:top w:type="dxa" w:w="60"/>
               <w:left w:type="dxa" w:w="100"/>
@@ -29175,7 +29675,6 @@
         <w:tc>
           <w:tcPr>
             <w:tcW w:type="dxa" w:w="2160"/>
-            <w:shd w:fill="F3F4F6" w:val="clear"/>
             <w:tcMar>
               <w:top w:type="dxa" w:w="60"/>
               <w:left w:type="dxa" w:w="100"/>
@@ -29200,7 +29699,6 @@
         <w:tc>
           <w:tcPr>
             <w:tcW w:type="dxa" w:w="3800"/>
-            <w:shd w:fill="F3F4F6" w:val="clear"/>
             <w:tcMar>
               <w:top w:type="dxa" w:w="60"/>
               <w:left w:type="dxa" w:w="100"/>
@@ -29227,6 +29725,7 @@
         <w:tc>
           <w:tcPr>
             <w:tcW w:type="dxa" w:w="1700"/>
+            <w:shd w:fill="F3F4F6" w:val="clear"/>
             <w:tcMar>
               <w:top w:type="dxa" w:w="60"/>
               <w:left w:type="dxa" w:w="100"/>
@@ -29251,6 +29750,7 @@
         <w:tc>
           <w:tcPr>
             <w:tcW w:type="dxa" w:w="1700"/>
+            <w:shd w:fill="F3F4F6" w:val="clear"/>
             <w:tcMar>
               <w:top w:type="dxa" w:w="60"/>
               <w:left w:type="dxa" w:w="100"/>
@@ -29275,6 +29775,7 @@
         <w:tc>
           <w:tcPr>
             <w:tcW w:type="dxa" w:w="2160"/>
+            <w:shd w:fill="F3F4F6" w:val="clear"/>
             <w:tcMar>
               <w:top w:type="dxa" w:w="60"/>
               <w:left w:type="dxa" w:w="100"/>
@@ -29299,6 +29800,7 @@
         <w:tc>
           <w:tcPr>
             <w:tcW w:type="dxa" w:w="3800"/>
+            <w:shd w:fill="F3F4F6" w:val="clear"/>
             <w:tcMar>
               <w:top w:type="dxa" w:w="60"/>
               <w:left w:type="dxa" w:w="100"/>
@@ -29325,7 +29827,6 @@
         <w:tc>
           <w:tcPr>
             <w:tcW w:type="dxa" w:w="1700"/>
-            <w:shd w:fill="F3F4F6" w:val="clear"/>
             <w:tcMar>
               <w:top w:type="dxa" w:w="60"/>
               <w:left w:type="dxa" w:w="100"/>
@@ -29350,7 +29851,6 @@
         <w:tc>
           <w:tcPr>
             <w:tcW w:type="dxa" w:w="1700"/>
-            <w:shd w:fill="F3F4F6" w:val="clear"/>
             <w:tcMar>
               <w:top w:type="dxa" w:w="60"/>
               <w:left w:type="dxa" w:w="100"/>
@@ -29375,7 +29875,6 @@
         <w:tc>
           <w:tcPr>
             <w:tcW w:type="dxa" w:w="2160"/>
-            <w:shd w:fill="F3F4F6" w:val="clear"/>
             <w:tcMar>
               <w:top w:type="dxa" w:w="60"/>
               <w:left w:type="dxa" w:w="100"/>
@@ -29400,7 +29899,6 @@
         <w:tc>
           <w:tcPr>
             <w:tcW w:type="dxa" w:w="3800"/>
-            <w:shd w:fill="F3F4F6" w:val="clear"/>
             <w:tcMar>
               <w:top w:type="dxa" w:w="60"/>
               <w:left w:type="dxa" w:w="100"/>
@@ -29427,6 +29925,7 @@
         <w:tc>
           <w:tcPr>
             <w:tcW w:type="dxa" w:w="1700"/>
+            <w:shd w:fill="F3F4F6" w:val="clear"/>
             <w:tcMar>
               <w:top w:type="dxa" w:w="60"/>
               <w:left w:type="dxa" w:w="100"/>
@@ -29451,6 +29950,7 @@
         <w:tc>
           <w:tcPr>
             <w:tcW w:type="dxa" w:w="1700"/>
+            <w:shd w:fill="F3F4F6" w:val="clear"/>
             <w:tcMar>
               <w:top w:type="dxa" w:w="60"/>
               <w:left w:type="dxa" w:w="100"/>
@@ -29475,6 +29975,7 @@
         <w:tc>
           <w:tcPr>
             <w:tcW w:type="dxa" w:w="2160"/>
+            <w:shd w:fill="F3F4F6" w:val="clear"/>
             <w:tcMar>
               <w:top w:type="dxa" w:w="60"/>
               <w:left w:type="dxa" w:w="100"/>
@@ -29499,6 +30000,7 @@
         <w:tc>
           <w:tcPr>
             <w:tcW w:type="dxa" w:w="3800"/>
+            <w:shd w:fill="F3F4F6" w:val="clear"/>
             <w:tcMar>
               <w:top w:type="dxa" w:w="60"/>
               <w:left w:type="dxa" w:w="100"/>
@@ -29525,7 +30027,6 @@
         <w:tc>
           <w:tcPr>
             <w:tcW w:type="dxa" w:w="1700"/>
-            <w:shd w:fill="F3F4F6" w:val="clear"/>
             <w:tcMar>
               <w:top w:type="dxa" w:w="60"/>
               <w:left w:type="dxa" w:w="100"/>
@@ -29550,7 +30051,6 @@
         <w:tc>
           <w:tcPr>
             <w:tcW w:type="dxa" w:w="1700"/>
-            <w:shd w:fill="F3F4F6" w:val="clear"/>
             <w:tcMar>
               <w:top w:type="dxa" w:w="60"/>
               <w:left w:type="dxa" w:w="100"/>
@@ -29575,7 +30075,6 @@
         <w:tc>
           <w:tcPr>
             <w:tcW w:type="dxa" w:w="2160"/>
-            <w:shd w:fill="F3F4F6" w:val="clear"/>
             <w:tcMar>
               <w:top w:type="dxa" w:w="60"/>
               <w:left w:type="dxa" w:w="100"/>
@@ -29600,7 +30099,6 @@
         <w:tc>
           <w:tcPr>
             <w:tcW w:type="dxa" w:w="3800"/>
-            <w:shd w:fill="F3F4F6" w:val="clear"/>
             <w:tcMar>
               <w:top w:type="dxa" w:w="60"/>
               <w:left w:type="dxa" w:w="100"/>
@@ -29627,6 +30125,7 @@
         <w:tc>
           <w:tcPr>
             <w:tcW w:type="dxa" w:w="1700"/>
+            <w:shd w:fill="F3F4F6" w:val="clear"/>
             <w:tcMar>
               <w:top w:type="dxa" w:w="60"/>
               <w:left w:type="dxa" w:w="100"/>
@@ -29651,6 +30150,7 @@
         <w:tc>
           <w:tcPr>
             <w:tcW w:type="dxa" w:w="1700"/>
+            <w:shd w:fill="F3F4F6" w:val="clear"/>
             <w:tcMar>
               <w:top w:type="dxa" w:w="60"/>
               <w:left w:type="dxa" w:w="100"/>
@@ -29675,6 +30175,7 @@
         <w:tc>
           <w:tcPr>
             <w:tcW w:type="dxa" w:w="2160"/>
+            <w:shd w:fill="F3F4F6" w:val="clear"/>
             <w:tcMar>
               <w:top w:type="dxa" w:w="60"/>
               <w:left w:type="dxa" w:w="100"/>
@@ -29699,6 +30200,7 @@
         <w:tc>
           <w:tcPr>
             <w:tcW w:type="dxa" w:w="3800"/>
+            <w:shd w:fill="F3F4F6" w:val="clear"/>
             <w:tcMar>
               <w:top w:type="dxa" w:w="60"/>
               <w:left w:type="dxa" w:w="100"/>
@@ -29725,7 +30227,6 @@
         <w:tc>
           <w:tcPr>
             <w:tcW w:type="dxa" w:w="1700"/>
-            <w:shd w:fill="F3F4F6" w:val="clear"/>
             <w:tcMar>
               <w:top w:type="dxa" w:w="60"/>
               <w:left w:type="dxa" w:w="100"/>
@@ -29750,7 +30251,6 @@
         <w:tc>
           <w:tcPr>
             <w:tcW w:type="dxa" w:w="1700"/>
-            <w:shd w:fill="F3F4F6" w:val="clear"/>
             <w:tcMar>
               <w:top w:type="dxa" w:w="60"/>
               <w:left w:type="dxa" w:w="100"/>
@@ -29775,7 +30275,6 @@
         <w:tc>
           <w:tcPr>
             <w:tcW w:type="dxa" w:w="2160"/>
-            <w:shd w:fill="F3F4F6" w:val="clear"/>
             <w:tcMar>
               <w:top w:type="dxa" w:w="60"/>
               <w:left w:type="dxa" w:w="100"/>
@@ -29800,7 +30299,6 @@
         <w:tc>
           <w:tcPr>
             <w:tcW w:type="dxa" w:w="3800"/>
-            <w:shd w:fill="F3F4F6" w:val="clear"/>
             <w:tcMar>
               <w:top w:type="dxa" w:w="60"/>
               <w:left w:type="dxa" w:w="100"/>
@@ -29827,6 +30325,7 @@
         <w:tc>
           <w:tcPr>
             <w:tcW w:type="dxa" w:w="1700"/>
+            <w:shd w:fill="F3F4F6" w:val="clear"/>
             <w:tcMar>
               <w:top w:type="dxa" w:w="60"/>
               <w:left w:type="dxa" w:w="100"/>
@@ -29851,6 +30350,7 @@
         <w:tc>
           <w:tcPr>
             <w:tcW w:type="dxa" w:w="1700"/>
+            <w:shd w:fill="F3F4F6" w:val="clear"/>
             <w:tcMar>
               <w:top w:type="dxa" w:w="60"/>
               <w:left w:type="dxa" w:w="100"/>
@@ -29875,6 +30375,7 @@
         <w:tc>
           <w:tcPr>
             <w:tcW w:type="dxa" w:w="2160"/>
+            <w:shd w:fill="F3F4F6" w:val="clear"/>
             <w:tcMar>
               <w:top w:type="dxa" w:w="60"/>
               <w:left w:type="dxa" w:w="100"/>
@@ -29899,6 +30400,7 @@
         <w:tc>
           <w:tcPr>
             <w:tcW w:type="dxa" w:w="3800"/>
+            <w:shd w:fill="F3F4F6" w:val="clear"/>
             <w:tcMar>
               <w:top w:type="dxa" w:w="60"/>
               <w:left w:type="dxa" w:w="100"/>
@@ -29925,7 +30427,6 @@
         <w:tc>
           <w:tcPr>
             <w:tcW w:type="dxa" w:w="1700"/>
-            <w:shd w:fill="F3F4F6" w:val="clear"/>
             <w:tcMar>
               <w:top w:type="dxa" w:w="60"/>
               <w:left w:type="dxa" w:w="100"/>
@@ -29950,7 +30451,6 @@
         <w:tc>
           <w:tcPr>
             <w:tcW w:type="dxa" w:w="1700"/>
-            <w:shd w:fill="F3F4F6" w:val="clear"/>
             <w:tcMar>
               <w:top w:type="dxa" w:w="60"/>
               <w:left w:type="dxa" w:w="100"/>
@@ -29975,7 +30475,6 @@
         <w:tc>
           <w:tcPr>
             <w:tcW w:type="dxa" w:w="2160"/>
-            <w:shd w:fill="F3F4F6" w:val="clear"/>
             <w:tcMar>
               <w:top w:type="dxa" w:w="60"/>
               <w:left w:type="dxa" w:w="100"/>
@@ -30000,7 +30499,6 @@
         <w:tc>
           <w:tcPr>
             <w:tcW w:type="dxa" w:w="3800"/>
-            <w:shd w:fill="F3F4F6" w:val="clear"/>
             <w:tcMar>
               <w:top w:type="dxa" w:w="60"/>
               <w:left w:type="dxa" w:w="100"/>
@@ -30027,6 +30525,7 @@
         <w:tc>
           <w:tcPr>
             <w:tcW w:type="dxa" w:w="1700"/>
+            <w:shd w:fill="F3F4F6" w:val="clear"/>
             <w:tcMar>
               <w:top w:type="dxa" w:w="60"/>
               <w:left w:type="dxa" w:w="100"/>
@@ -30051,6 +30550,7 @@
         <w:tc>
           <w:tcPr>
             <w:tcW w:type="dxa" w:w="1700"/>
+            <w:shd w:fill="F3F4F6" w:val="clear"/>
             <w:tcMar>
               <w:top w:type="dxa" w:w="60"/>
               <w:left w:type="dxa" w:w="100"/>
@@ -30075,6 +30575,7 @@
         <w:tc>
           <w:tcPr>
             <w:tcW w:type="dxa" w:w="2160"/>
+            <w:shd w:fill="F3F4F6" w:val="clear"/>
             <w:tcMar>
               <w:top w:type="dxa" w:w="60"/>
               <w:left w:type="dxa" w:w="100"/>
@@ -30099,6 +30600,7 @@
         <w:tc>
           <w:tcPr>
             <w:tcW w:type="dxa" w:w="3800"/>
+            <w:shd w:fill="F3F4F6" w:val="clear"/>
             <w:tcMar>
               <w:top w:type="dxa" w:w="60"/>
               <w:left w:type="dxa" w:w="100"/>
@@ -30125,7 +30627,6 @@
         <w:tc>
           <w:tcPr>
             <w:tcW w:type="dxa" w:w="1700"/>
-            <w:shd w:fill="F3F4F6" w:val="clear"/>
             <w:tcMar>
               <w:top w:type="dxa" w:w="60"/>
               <w:left w:type="dxa" w:w="100"/>
@@ -30150,7 +30651,6 @@
         <w:tc>
           <w:tcPr>
             <w:tcW w:type="dxa" w:w="1700"/>
-            <w:shd w:fill="F3F4F6" w:val="clear"/>
             <w:tcMar>
               <w:top w:type="dxa" w:w="60"/>
               <w:left w:type="dxa" w:w="100"/>
@@ -30175,7 +30675,6 @@
         <w:tc>
           <w:tcPr>
             <w:tcW w:type="dxa" w:w="2160"/>
-            <w:shd w:fill="F3F4F6" w:val="clear"/>
             <w:tcMar>
               <w:top w:type="dxa" w:w="60"/>
               <w:left w:type="dxa" w:w="100"/>
@@ -30200,7 +30699,6 @@
         <w:tc>
           <w:tcPr>
             <w:tcW w:type="dxa" w:w="3800"/>
-            <w:shd w:fill="F3F4F6" w:val="clear"/>
             <w:tcMar>
               <w:top w:type="dxa" w:w="60"/>
               <w:left w:type="dxa" w:w="100"/>
@@ -30227,6 +30725,7 @@
         <w:tc>
           <w:tcPr>
             <w:tcW w:type="dxa" w:w="1700"/>
+            <w:shd w:fill="F3F4F6" w:val="clear"/>
             <w:tcMar>
               <w:top w:type="dxa" w:w="60"/>
               <w:left w:type="dxa" w:w="100"/>
@@ -30251,6 +30750,7 @@
         <w:tc>
           <w:tcPr>
             <w:tcW w:type="dxa" w:w="1700"/>
+            <w:shd w:fill="F3F4F6" w:val="clear"/>
             <w:tcMar>
               <w:top w:type="dxa" w:w="60"/>
               <w:left w:type="dxa" w:w="100"/>
@@ -30275,6 +30775,7 @@
         <w:tc>
           <w:tcPr>
             <w:tcW w:type="dxa" w:w="2160"/>
+            <w:shd w:fill="F3F4F6" w:val="clear"/>
             <w:tcMar>
               <w:top w:type="dxa" w:w="60"/>
               <w:left w:type="dxa" w:w="100"/>
@@ -30299,6 +30800,7 @@
         <w:tc>
           <w:tcPr>
             <w:tcW w:type="dxa" w:w="3800"/>
+            <w:shd w:fill="F3F4F6" w:val="clear"/>
             <w:tcMar>
               <w:top w:type="dxa" w:w="60"/>
               <w:left w:type="dxa" w:w="100"/>
@@ -30325,7 +30827,6 @@
         <w:tc>
           <w:tcPr>
             <w:tcW w:type="dxa" w:w="1700"/>
-            <w:shd w:fill="F3F4F6" w:val="clear"/>
             <w:tcMar>
               <w:top w:type="dxa" w:w="60"/>
               <w:left w:type="dxa" w:w="100"/>
@@ -30350,7 +30851,6 @@
         <w:tc>
           <w:tcPr>
             <w:tcW w:type="dxa" w:w="1700"/>
-            <w:shd w:fill="F3F4F6" w:val="clear"/>
             <w:tcMar>
               <w:top w:type="dxa" w:w="60"/>
               <w:left w:type="dxa" w:w="100"/>
@@ -30375,7 +30875,6 @@
         <w:tc>
           <w:tcPr>
             <w:tcW w:type="dxa" w:w="2160"/>
-            <w:shd w:fill="F3F4F6" w:val="clear"/>
             <w:tcMar>
               <w:top w:type="dxa" w:w="60"/>
               <w:left w:type="dxa" w:w="100"/>
@@ -30400,7 +30899,6 @@
         <w:tc>
           <w:tcPr>
             <w:tcW w:type="dxa" w:w="3800"/>
-            <w:shd w:fill="F3F4F6" w:val="clear"/>
             <w:tcMar>
               <w:top w:type="dxa" w:w="60"/>
               <w:left w:type="dxa" w:w="100"/>
@@ -30427,6 +30925,7 @@
         <w:tc>
           <w:tcPr>
             <w:tcW w:type="dxa" w:w="1700"/>
+            <w:shd w:fill="F3F4F6" w:val="clear"/>
             <w:tcMar>
               <w:top w:type="dxa" w:w="60"/>
               <w:left w:type="dxa" w:w="100"/>
@@ -30451,6 +30950,7 @@
         <w:tc>
           <w:tcPr>
             <w:tcW w:type="dxa" w:w="1700"/>
+            <w:shd w:fill="F3F4F6" w:val="clear"/>
             <w:tcMar>
               <w:top w:type="dxa" w:w="60"/>
               <w:left w:type="dxa" w:w="100"/>
@@ -30475,6 +30975,7 @@
         <w:tc>
           <w:tcPr>
             <w:tcW w:type="dxa" w:w="2160"/>
+            <w:shd w:fill="F3F4F6" w:val="clear"/>
             <w:tcMar>
               <w:top w:type="dxa" w:w="60"/>
               <w:left w:type="dxa" w:w="100"/>
@@ -30499,6 +31000,7 @@
         <w:tc>
           <w:tcPr>
             <w:tcW w:type="dxa" w:w="3800"/>
+            <w:shd w:fill="F3F4F6" w:val="clear"/>
             <w:tcMar>
               <w:top w:type="dxa" w:w="60"/>
               <w:left w:type="dxa" w:w="100"/>
@@ -30525,7 +31027,6 @@
         <w:tc>
           <w:tcPr>
             <w:tcW w:type="dxa" w:w="1700"/>
-            <w:shd w:fill="F3F4F6" w:val="clear"/>
             <w:tcMar>
               <w:top w:type="dxa" w:w="60"/>
               <w:left w:type="dxa" w:w="100"/>
@@ -30550,7 +31051,6 @@
         <w:tc>
           <w:tcPr>
             <w:tcW w:type="dxa" w:w="1700"/>
-            <w:shd w:fill="F3F4F6" w:val="clear"/>
             <w:tcMar>
               <w:top w:type="dxa" w:w="60"/>
               <w:left w:type="dxa" w:w="100"/>
@@ -30575,7 +31075,6 @@
         <w:tc>
           <w:tcPr>
             <w:tcW w:type="dxa" w:w="2160"/>
-            <w:shd w:fill="F3F4F6" w:val="clear"/>
             <w:tcMar>
               <w:top w:type="dxa" w:w="60"/>
               <w:left w:type="dxa" w:w="100"/>
@@ -30600,7 +31099,6 @@
         <w:tc>
           <w:tcPr>
             <w:tcW w:type="dxa" w:w="3800"/>
-            <w:shd w:fill="F3F4F6" w:val="clear"/>
             <w:tcMar>
               <w:top w:type="dxa" w:w="60"/>
               <w:left w:type="dxa" w:w="100"/>
@@ -30627,6 +31125,7 @@
         <w:tc>
           <w:tcPr>
             <w:tcW w:type="dxa" w:w="1700"/>
+            <w:shd w:fill="F3F4F6" w:val="clear"/>
             <w:tcMar>
               <w:top w:type="dxa" w:w="60"/>
               <w:left w:type="dxa" w:w="100"/>
@@ -30651,6 +31150,7 @@
         <w:tc>
           <w:tcPr>
             <w:tcW w:type="dxa" w:w="1700"/>
+            <w:shd w:fill="F3F4F6" w:val="clear"/>
             <w:tcMar>
               <w:top w:type="dxa" w:w="60"/>
               <w:left w:type="dxa" w:w="100"/>
@@ -30675,6 +31175,7 @@
         <w:tc>
           <w:tcPr>
             <w:tcW w:type="dxa" w:w="2160"/>
+            <w:shd w:fill="F3F4F6" w:val="clear"/>
             <w:tcMar>
               <w:top w:type="dxa" w:w="60"/>
               <w:left w:type="dxa" w:w="100"/>
@@ -30699,6 +31200,7 @@
         <w:tc>
           <w:tcPr>
             <w:tcW w:type="dxa" w:w="3800"/>
+            <w:shd w:fill="F3F4F6" w:val="clear"/>
             <w:tcMar>
               <w:top w:type="dxa" w:w="60"/>
               <w:left w:type="dxa" w:w="100"/>
@@ -30725,7 +31227,6 @@
         <w:tc>
           <w:tcPr>
             <w:tcW w:type="dxa" w:w="1700"/>
-            <w:shd w:fill="F3F4F6" w:val="clear"/>
             <w:tcMar>
               <w:top w:type="dxa" w:w="60"/>
               <w:left w:type="dxa" w:w="100"/>
@@ -30750,7 +31251,6 @@
         <w:tc>
           <w:tcPr>
             <w:tcW w:type="dxa" w:w="1700"/>
-            <w:shd w:fill="F3F4F6" w:val="clear"/>
             <w:tcMar>
               <w:top w:type="dxa" w:w="60"/>
               <w:left w:type="dxa" w:w="100"/>
@@ -30775,7 +31275,6 @@
         <w:tc>
           <w:tcPr>
             <w:tcW w:type="dxa" w:w="2160"/>
-            <w:shd w:fill="F3F4F6" w:val="clear"/>
             <w:tcMar>
               <w:top w:type="dxa" w:w="60"/>
               <w:left w:type="dxa" w:w="100"/>
@@ -30800,7 +31299,6 @@
         <w:tc>
           <w:tcPr>
             <w:tcW w:type="dxa" w:w="3800"/>
-            <w:shd w:fill="F3F4F6" w:val="clear"/>
             <w:tcMar>
               <w:top w:type="dxa" w:w="60"/>
               <w:left w:type="dxa" w:w="100"/>
@@ -30827,6 +31325,7 @@
         <w:tc>
           <w:tcPr>
             <w:tcW w:type="dxa" w:w="1700"/>
+            <w:shd w:fill="F3F4F6" w:val="clear"/>
             <w:tcMar>
               <w:top w:type="dxa" w:w="60"/>
               <w:left w:type="dxa" w:w="100"/>
@@ -30851,6 +31350,7 @@
         <w:tc>
           <w:tcPr>
             <w:tcW w:type="dxa" w:w="1700"/>
+            <w:shd w:fill="F3F4F6" w:val="clear"/>
             <w:tcMar>
               <w:top w:type="dxa" w:w="60"/>
               <w:left w:type="dxa" w:w="100"/>
@@ -30875,6 +31375,7 @@
         <w:tc>
           <w:tcPr>
             <w:tcW w:type="dxa" w:w="2160"/>
+            <w:shd w:fill="F3F4F6" w:val="clear"/>
             <w:tcMar>
               <w:top w:type="dxa" w:w="60"/>
               <w:left w:type="dxa" w:w="100"/>
@@ -30899,6 +31400,7 @@
         <w:tc>
           <w:tcPr>
             <w:tcW w:type="dxa" w:w="3800"/>
+            <w:shd w:fill="F3F4F6" w:val="clear"/>
             <w:tcMar>
               <w:top w:type="dxa" w:w="60"/>
               <w:left w:type="dxa" w:w="100"/>
@@ -30925,7 +31427,6 @@
         <w:tc>
           <w:tcPr>
             <w:tcW w:type="dxa" w:w="1700"/>
-            <w:shd w:fill="F3F4F6" w:val="clear"/>
             <w:tcMar>
               <w:top w:type="dxa" w:w="60"/>
               <w:left w:type="dxa" w:w="100"/>
@@ -30950,7 +31451,6 @@
         <w:tc>
           <w:tcPr>
             <w:tcW w:type="dxa" w:w="1700"/>
-            <w:shd w:fill="F3F4F6" w:val="clear"/>
             <w:tcMar>
               <w:top w:type="dxa" w:w="60"/>
               <w:left w:type="dxa" w:w="100"/>
@@ -30975,7 +31475,6 @@
         <w:tc>
           <w:tcPr>
             <w:tcW w:type="dxa" w:w="2160"/>
-            <w:shd w:fill="F3F4F6" w:val="clear"/>
             <w:tcMar>
               <w:top w:type="dxa" w:w="60"/>
               <w:left w:type="dxa" w:w="100"/>
@@ -31000,7 +31499,6 @@
         <w:tc>
           <w:tcPr>
             <w:tcW w:type="dxa" w:w="3800"/>
-            <w:shd w:fill="F3F4F6" w:val="clear"/>
             <w:tcMar>
               <w:top w:type="dxa" w:w="60"/>
               <w:left w:type="dxa" w:w="100"/>
@@ -31027,6 +31525,7 @@
         <w:tc>
           <w:tcPr>
             <w:tcW w:type="dxa" w:w="1700"/>
+            <w:shd w:fill="F3F4F6" w:val="clear"/>
             <w:tcMar>
               <w:top w:type="dxa" w:w="60"/>
               <w:left w:type="dxa" w:w="100"/>
@@ -31051,6 +31550,7 @@
         <w:tc>
           <w:tcPr>
             <w:tcW w:type="dxa" w:w="1700"/>
+            <w:shd w:fill="F3F4F6" w:val="clear"/>
             <w:tcMar>
               <w:top w:type="dxa" w:w="60"/>
               <w:left w:type="dxa" w:w="100"/>
@@ -31075,6 +31575,7 @@
         <w:tc>
           <w:tcPr>
             <w:tcW w:type="dxa" w:w="2160"/>
+            <w:shd w:fill="F3F4F6" w:val="clear"/>
             <w:tcMar>
               <w:top w:type="dxa" w:w="60"/>
               <w:left w:type="dxa" w:w="100"/>
@@ -31099,6 +31600,7 @@
         <w:tc>
           <w:tcPr>
             <w:tcW w:type="dxa" w:w="3800"/>
+            <w:shd w:fill="F3F4F6" w:val="clear"/>
             <w:tcMar>
               <w:top w:type="dxa" w:w="60"/>
               <w:left w:type="dxa" w:w="100"/>
@@ -31125,7 +31627,6 @@
         <w:tc>
           <w:tcPr>
             <w:tcW w:type="dxa" w:w="1700"/>
-            <w:shd w:fill="F3F4F6" w:val="clear"/>
             <w:tcMar>
               <w:top w:type="dxa" w:w="60"/>
               <w:left w:type="dxa" w:w="100"/>
@@ -31150,7 +31651,6 @@
         <w:tc>
           <w:tcPr>
             <w:tcW w:type="dxa" w:w="1700"/>
-            <w:shd w:fill="F3F4F6" w:val="clear"/>
             <w:tcMar>
               <w:top w:type="dxa" w:w="60"/>
               <w:left w:type="dxa" w:w="100"/>
@@ -31175,7 +31675,6 @@
         <w:tc>
           <w:tcPr>
             <w:tcW w:type="dxa" w:w="2160"/>
-            <w:shd w:fill="F3F4F6" w:val="clear"/>
             <w:tcMar>
               <w:top w:type="dxa" w:w="60"/>
               <w:left w:type="dxa" w:w="100"/>
@@ -31200,7 +31699,6 @@
         <w:tc>
           <w:tcPr>
             <w:tcW w:type="dxa" w:w="3800"/>
-            <w:shd w:fill="F3F4F6" w:val="clear"/>
             <w:tcMar>
               <w:top w:type="dxa" w:w="60"/>
               <w:left w:type="dxa" w:w="100"/>
@@ -31227,6 +31725,7 @@
         <w:tc>
           <w:tcPr>
             <w:tcW w:type="dxa" w:w="1700"/>
+            <w:shd w:fill="F3F4F6" w:val="clear"/>
             <w:tcMar>
               <w:top w:type="dxa" w:w="60"/>
               <w:left w:type="dxa" w:w="100"/>
@@ -31251,6 +31750,7 @@
         <w:tc>
           <w:tcPr>
             <w:tcW w:type="dxa" w:w="1700"/>
+            <w:shd w:fill="F3F4F6" w:val="clear"/>
             <w:tcMar>
               <w:top w:type="dxa" w:w="60"/>
               <w:left w:type="dxa" w:w="100"/>
@@ -31275,6 +31775,7 @@
         <w:tc>
           <w:tcPr>
             <w:tcW w:type="dxa" w:w="2160"/>
+            <w:shd w:fill="F3F4F6" w:val="clear"/>
             <w:tcMar>
               <w:top w:type="dxa" w:w="60"/>
               <w:left w:type="dxa" w:w="100"/>
@@ -31299,6 +31800,7 @@
         <w:tc>
           <w:tcPr>
             <w:tcW w:type="dxa" w:w="3800"/>
+            <w:shd w:fill="F3F4F6" w:val="clear"/>
             <w:tcMar>
               <w:top w:type="dxa" w:w="60"/>
               <w:left w:type="dxa" w:w="100"/>
@@ -31325,7 +31827,6 @@
         <w:tc>
           <w:tcPr>
             <w:tcW w:type="dxa" w:w="1700"/>
-            <w:shd w:fill="F3F4F6" w:val="clear"/>
             <w:tcMar>
               <w:top w:type="dxa" w:w="60"/>
               <w:left w:type="dxa" w:w="100"/>
@@ -31350,7 +31851,6 @@
         <w:tc>
           <w:tcPr>
             <w:tcW w:type="dxa" w:w="1700"/>
-            <w:shd w:fill="F3F4F6" w:val="clear"/>
             <w:tcMar>
               <w:top w:type="dxa" w:w="60"/>
               <w:left w:type="dxa" w:w="100"/>
@@ -31375,7 +31875,6 @@
         <w:tc>
           <w:tcPr>
             <w:tcW w:type="dxa" w:w="2160"/>
-            <w:shd w:fill="F3F4F6" w:val="clear"/>
             <w:tcMar>
               <w:top w:type="dxa" w:w="60"/>
               <w:left w:type="dxa" w:w="100"/>
@@ -31400,7 +31899,6 @@
         <w:tc>
           <w:tcPr>
             <w:tcW w:type="dxa" w:w="3800"/>
-            <w:shd w:fill="F3F4F6" w:val="clear"/>
             <w:tcMar>
               <w:top w:type="dxa" w:w="60"/>
               <w:left w:type="dxa" w:w="100"/>
@@ -31427,6 +31925,7 @@
         <w:tc>
           <w:tcPr>
             <w:tcW w:type="dxa" w:w="1700"/>
+            <w:shd w:fill="F3F4F6" w:val="clear"/>
             <w:tcMar>
               <w:top w:type="dxa" w:w="60"/>
               <w:left w:type="dxa" w:w="100"/>
@@ -31451,6 +31950,7 @@
         <w:tc>
           <w:tcPr>
             <w:tcW w:type="dxa" w:w="1700"/>
+            <w:shd w:fill="F3F4F6" w:val="clear"/>
             <w:tcMar>
               <w:top w:type="dxa" w:w="60"/>
               <w:left w:type="dxa" w:w="100"/>
@@ -31475,6 +31975,7 @@
         <w:tc>
           <w:tcPr>
             <w:tcW w:type="dxa" w:w="2160"/>
+            <w:shd w:fill="F3F4F6" w:val="clear"/>
             <w:tcMar>
               <w:top w:type="dxa" w:w="60"/>
               <w:left w:type="dxa" w:w="100"/>
@@ -31499,6 +32000,7 @@
         <w:tc>
           <w:tcPr>
             <w:tcW w:type="dxa" w:w="3800"/>
+            <w:shd w:fill="F3F4F6" w:val="clear"/>
             <w:tcMar>
               <w:top w:type="dxa" w:w="60"/>
               <w:left w:type="dxa" w:w="100"/>
@@ -31525,7 +32027,6 @@
         <w:tc>
           <w:tcPr>
             <w:tcW w:type="dxa" w:w="1700"/>
-            <w:shd w:fill="F3F4F6" w:val="clear"/>
             <w:tcMar>
               <w:top w:type="dxa" w:w="60"/>
               <w:left w:type="dxa" w:w="100"/>
@@ -31550,7 +32051,6 @@
         <w:tc>
           <w:tcPr>
             <w:tcW w:type="dxa" w:w="1700"/>
-            <w:shd w:fill="F3F4F6" w:val="clear"/>
             <w:tcMar>
               <w:top w:type="dxa" w:w="60"/>
               <w:left w:type="dxa" w:w="100"/>
@@ -31575,7 +32075,6 @@
         <w:tc>
           <w:tcPr>
             <w:tcW w:type="dxa" w:w="2160"/>
-            <w:shd w:fill="F3F4F6" w:val="clear"/>
             <w:tcMar>
               <w:top w:type="dxa" w:w="60"/>
               <w:left w:type="dxa" w:w="100"/>
@@ -31600,7 +32099,6 @@
         <w:tc>
           <w:tcPr>
             <w:tcW w:type="dxa" w:w="3800"/>
-            <w:shd w:fill="F3F4F6" w:val="clear"/>
             <w:tcMar>
               <w:top w:type="dxa" w:w="60"/>
               <w:left w:type="dxa" w:w="100"/>
@@ -31627,6 +32125,7 @@
         <w:tc>
           <w:tcPr>
             <w:tcW w:type="dxa" w:w="1700"/>
+            <w:shd w:fill="F3F4F6" w:val="clear"/>
             <w:tcMar>
               <w:top w:type="dxa" w:w="60"/>
               <w:left w:type="dxa" w:w="100"/>
@@ -31651,6 +32150,7 @@
         <w:tc>
           <w:tcPr>
             <w:tcW w:type="dxa" w:w="1700"/>
+            <w:shd w:fill="F3F4F6" w:val="clear"/>
             <w:tcMar>
               <w:top w:type="dxa" w:w="60"/>
               <w:left w:type="dxa" w:w="100"/>
@@ -31675,6 +32175,7 @@
         <w:tc>
           <w:tcPr>
             <w:tcW w:type="dxa" w:w="2160"/>
+            <w:shd w:fill="F3F4F6" w:val="clear"/>
             <w:tcMar>
               <w:top w:type="dxa" w:w="60"/>
               <w:left w:type="dxa" w:w="100"/>
@@ -31699,6 +32200,7 @@
         <w:tc>
           <w:tcPr>
             <w:tcW w:type="dxa" w:w="3800"/>
+            <w:shd w:fill="F3F4F6" w:val="clear"/>
             <w:tcMar>
               <w:top w:type="dxa" w:w="60"/>
               <w:left w:type="dxa" w:w="100"/>
@@ -31725,7 +32227,6 @@
         <w:tc>
           <w:tcPr>
             <w:tcW w:type="dxa" w:w="1700"/>
-            <w:shd w:fill="F3F4F6" w:val="clear"/>
             <w:tcMar>
               <w:top w:type="dxa" w:w="60"/>
               <w:left w:type="dxa" w:w="100"/>
@@ -31750,7 +32251,6 @@
         <w:tc>
           <w:tcPr>
             <w:tcW w:type="dxa" w:w="1700"/>
-            <w:shd w:fill="F3F4F6" w:val="clear"/>
             <w:tcMar>
               <w:top w:type="dxa" w:w="60"/>
               <w:left w:type="dxa" w:w="100"/>
@@ -31775,7 +32275,6 @@
         <w:tc>
           <w:tcPr>
             <w:tcW w:type="dxa" w:w="2160"/>
-            <w:shd w:fill="F3F4F6" w:val="clear"/>
             <w:tcMar>
               <w:top w:type="dxa" w:w="60"/>
               <w:left w:type="dxa" w:w="100"/>
@@ -31800,7 +32299,6 @@
         <w:tc>
           <w:tcPr>
             <w:tcW w:type="dxa" w:w="3800"/>
-            <w:shd w:fill="F3F4F6" w:val="clear"/>
             <w:tcMar>
               <w:top w:type="dxa" w:w="60"/>
               <w:left w:type="dxa" w:w="100"/>
@@ -31827,6 +32325,7 @@
         <w:tc>
           <w:tcPr>
             <w:tcW w:type="dxa" w:w="1700"/>
+            <w:shd w:fill="F3F4F6" w:val="clear"/>
             <w:tcMar>
               <w:top w:type="dxa" w:w="60"/>
               <w:left w:type="dxa" w:w="100"/>
@@ -31851,6 +32350,7 @@
         <w:tc>
           <w:tcPr>
             <w:tcW w:type="dxa" w:w="1700"/>
+            <w:shd w:fill="F3F4F6" w:val="clear"/>
             <w:tcMar>
               <w:top w:type="dxa" w:w="60"/>
               <w:left w:type="dxa" w:w="100"/>
@@ -31875,6 +32375,7 @@
         <w:tc>
           <w:tcPr>
             <w:tcW w:type="dxa" w:w="2160"/>
+            <w:shd w:fill="F3F4F6" w:val="clear"/>
             <w:tcMar>
               <w:top w:type="dxa" w:w="60"/>
               <w:left w:type="dxa" w:w="100"/>
@@ -31899,6 +32400,7 @@
         <w:tc>
           <w:tcPr>
             <w:tcW w:type="dxa" w:w="3800"/>
+            <w:shd w:fill="F3F4F6" w:val="clear"/>
             <w:tcMar>
               <w:top w:type="dxa" w:w="60"/>
               <w:left w:type="dxa" w:w="100"/>
@@ -31925,7 +32427,6 @@
         <w:tc>
           <w:tcPr>
             <w:tcW w:type="dxa" w:w="1700"/>
-            <w:shd w:fill="F3F4F6" w:val="clear"/>
             <w:tcMar>
               <w:top w:type="dxa" w:w="60"/>
               <w:left w:type="dxa" w:w="100"/>
@@ -31950,7 +32451,6 @@
         <w:tc>
           <w:tcPr>
             <w:tcW w:type="dxa" w:w="1700"/>
-            <w:shd w:fill="F3F4F6" w:val="clear"/>
             <w:tcMar>
               <w:top w:type="dxa" w:w="60"/>
               <w:left w:type="dxa" w:w="100"/>
@@ -31975,7 +32475,6 @@
         <w:tc>
           <w:tcPr>
             <w:tcW w:type="dxa" w:w="2160"/>
-            <w:shd w:fill="F3F4F6" w:val="clear"/>
             <w:tcMar>
               <w:top w:type="dxa" w:w="60"/>
               <w:left w:type="dxa" w:w="100"/>
@@ -32000,7 +32499,6 @@
         <w:tc>
           <w:tcPr>
             <w:tcW w:type="dxa" w:w="3800"/>
-            <w:shd w:fill="F3F4F6" w:val="clear"/>
             <w:tcMar>
               <w:top w:type="dxa" w:w="60"/>
               <w:left w:type="dxa" w:w="100"/>
@@ -32027,6 +32525,7 @@
         <w:tc>
           <w:tcPr>
             <w:tcW w:type="dxa" w:w="1700"/>
+            <w:shd w:fill="F3F4F6" w:val="clear"/>
             <w:tcMar>
               <w:top w:type="dxa" w:w="60"/>
               <w:left w:type="dxa" w:w="100"/>
@@ -32051,6 +32550,7 @@
         <w:tc>
           <w:tcPr>
             <w:tcW w:type="dxa" w:w="1700"/>
+            <w:shd w:fill="F3F4F6" w:val="clear"/>
             <w:tcMar>
               <w:top w:type="dxa" w:w="60"/>
               <w:left w:type="dxa" w:w="100"/>
@@ -32075,6 +32575,7 @@
         <w:tc>
           <w:tcPr>
             <w:tcW w:type="dxa" w:w="2160"/>
+            <w:shd w:fill="F3F4F6" w:val="clear"/>
             <w:tcMar>
               <w:top w:type="dxa" w:w="60"/>
               <w:left w:type="dxa" w:w="100"/>
@@ -32099,6 +32600,7 @@
         <w:tc>
           <w:tcPr>
             <w:tcW w:type="dxa" w:w="3800"/>
+            <w:shd w:fill="F3F4F6" w:val="clear"/>
             <w:tcMar>
               <w:top w:type="dxa" w:w="60"/>
               <w:left w:type="dxa" w:w="100"/>
@@ -32125,7 +32627,6 @@
         <w:tc>
           <w:tcPr>
             <w:tcW w:type="dxa" w:w="1700"/>
-            <w:shd w:fill="F3F4F6" w:val="clear"/>
             <w:tcMar>
               <w:top w:type="dxa" w:w="60"/>
               <w:left w:type="dxa" w:w="100"/>
@@ -32150,7 +32651,6 @@
         <w:tc>
           <w:tcPr>
             <w:tcW w:type="dxa" w:w="1700"/>
-            <w:shd w:fill="F3F4F6" w:val="clear"/>
             <w:tcMar>
               <w:top w:type="dxa" w:w="60"/>
               <w:left w:type="dxa" w:w="100"/>
@@ -32175,7 +32675,6 @@
         <w:tc>
           <w:tcPr>
             <w:tcW w:type="dxa" w:w="2160"/>
-            <w:shd w:fill="F3F4F6" w:val="clear"/>
             <w:tcMar>
               <w:top w:type="dxa" w:w="60"/>
               <w:left w:type="dxa" w:w="100"/>
@@ -32200,7 +32699,6 @@
         <w:tc>
           <w:tcPr>
             <w:tcW w:type="dxa" w:w="3800"/>
-            <w:shd w:fill="F3F4F6" w:val="clear"/>
             <w:tcMar>
               <w:top w:type="dxa" w:w="60"/>
               <w:left w:type="dxa" w:w="100"/>
@@ -32227,6 +32725,7 @@
         <w:tc>
           <w:tcPr>
             <w:tcW w:type="dxa" w:w="1700"/>
+            <w:shd w:fill="F3F4F6" w:val="clear"/>
             <w:tcMar>
               <w:top w:type="dxa" w:w="60"/>
               <w:left w:type="dxa" w:w="100"/>
@@ -32251,6 +32750,7 @@
         <w:tc>
           <w:tcPr>
             <w:tcW w:type="dxa" w:w="1700"/>
+            <w:shd w:fill="F3F4F6" w:val="clear"/>
             <w:tcMar>
               <w:top w:type="dxa" w:w="60"/>
               <w:left w:type="dxa" w:w="100"/>
@@ -32275,6 +32775,7 @@
         <w:tc>
           <w:tcPr>
             <w:tcW w:type="dxa" w:w="2160"/>
+            <w:shd w:fill="F3F4F6" w:val="clear"/>
             <w:tcMar>
               <w:top w:type="dxa" w:w="60"/>
               <w:left w:type="dxa" w:w="100"/>
@@ -32299,6 +32800,7 @@
         <w:tc>
           <w:tcPr>
             <w:tcW w:type="dxa" w:w="3800"/>
+            <w:shd w:fill="F3F4F6" w:val="clear"/>
             <w:tcMar>
               <w:top w:type="dxa" w:w="60"/>
               <w:left w:type="dxa" w:w="100"/>
@@ -33721,6 +34223,751 @@
                 <w:szCs w:val="19"/>
               </w:rPr>
               <w:t xml:space="preserve">Unique template code, e.g. 'CERT_EXPIRING'</w:t>
+            </w:r>
+          </w:p>
+        </w:tc>
+      </w:tr>
+      <w:tr>
+        <w:tc>
+          <w:tcPr>
+            <w:tcW w:type="dxa" w:w="1700"/>
+            <w:shd w:fill="F3F4F6" w:val="clear"/>
+            <w:tcMar>
+              <w:top w:type="dxa" w:w="60"/>
+              <w:left w:type="dxa" w:w="100"/>
+              <w:bottom w:type="dxa" w:w="60"/>
+              <w:right w:type="dxa" w:w="100"/>
+            </w:tcMar>
+            <w:vAlign w:val="center"/>
+          </w:tcPr>
+          <w:p>
+            <w:r>
+              <w:rPr>
+                <w:b w:val="false"/>
+                <w:bCs w:val="false"/>
+                <w:color w:val="111827"/>
+                <w:sz w:val="19"/>
+                <w:szCs w:val="19"/>
+              </w:rPr>
+              <w:t xml:space="preserve">notification_templates.subject</w:t>
+            </w:r>
+          </w:p>
+        </w:tc>
+        <w:tc>
+          <w:tcPr>
+            <w:tcW w:type="dxa" w:w="1700"/>
+            <w:shd w:fill="F3F4F6" w:val="clear"/>
+            <w:tcMar>
+              <w:top w:type="dxa" w:w="60"/>
+              <w:left w:type="dxa" w:w="100"/>
+              <w:bottom w:type="dxa" w:w="60"/>
+              <w:right w:type="dxa" w:w="100"/>
+            </w:tcMar>
+            <w:vAlign w:val="center"/>
+          </w:tcPr>
+          <w:p>
+            <w:r>
+              <w:rPr>
+                <w:b w:val="false"/>
+                <w:bCs w:val="false"/>
+                <w:color w:val="111827"/>
+                <w:sz w:val="19"/>
+                <w:szCs w:val="19"/>
+              </w:rPr>
+              <w:t xml:space="preserve">VARCHAR(200)</w:t>
+            </w:r>
+          </w:p>
+        </w:tc>
+        <w:tc>
+          <w:tcPr>
+            <w:tcW w:type="dxa" w:w="2160"/>
+            <w:shd w:fill="F3F4F6" w:val="clear"/>
+            <w:tcMar>
+              <w:top w:type="dxa" w:w="60"/>
+              <w:left w:type="dxa" w:w="100"/>
+              <w:bottom w:type="dxa" w:w="60"/>
+              <w:right w:type="dxa" w:w="100"/>
+            </w:tcMar>
+            <w:vAlign w:val="center"/>
+          </w:tcPr>
+          <w:p>
+            <w:r>
+              <w:rPr>
+                <w:b w:val="false"/>
+                <w:bCs w:val="false"/>
+                <w:color w:val="111827"/>
+                <w:sz w:val="19"/>
+                <w:szCs w:val="19"/>
+              </w:rPr>
+              <w:t xml:space="preserve">NULLABLE</w:t>
+            </w:r>
+          </w:p>
+        </w:tc>
+        <w:tc>
+          <w:tcPr>
+            <w:tcW w:type="dxa" w:w="3800"/>
+            <w:shd w:fill="F3F4F6" w:val="clear"/>
+            <w:tcMar>
+              <w:top w:type="dxa" w:w="60"/>
+              <w:left w:type="dxa" w:w="100"/>
+              <w:bottom w:type="dxa" w:w="60"/>
+              <w:right w:type="dxa" w:w="100"/>
+            </w:tcMar>
+            <w:vAlign w:val="center"/>
+          </w:tcPr>
+          <w:p>
+            <w:r>
+              <w:rPr>
+                <w:b w:val="false"/>
+                <w:bCs w:val="false"/>
+                <w:color w:val="111827"/>
+                <w:sz w:val="19"/>
+                <w:szCs w:val="19"/>
+              </w:rPr>
+              <w:t xml:space="preserve">Subject line, for channels that use one (email)</w:t>
+            </w:r>
+          </w:p>
+        </w:tc>
+      </w:tr>
+      <w:tr>
+        <w:tc>
+          <w:tcPr>
+            <w:tcW w:type="dxa" w:w="1700"/>
+            <w:tcMar>
+              <w:top w:type="dxa" w:w="60"/>
+              <w:left w:type="dxa" w:w="100"/>
+              <w:bottom w:type="dxa" w:w="60"/>
+              <w:right w:type="dxa" w:w="100"/>
+            </w:tcMar>
+            <w:vAlign w:val="center"/>
+          </w:tcPr>
+          <w:p>
+            <w:r>
+              <w:rPr>
+                <w:b w:val="false"/>
+                <w:bCs w:val="false"/>
+                <w:color w:val="111827"/>
+                <w:sz w:val="19"/>
+                <w:szCs w:val="19"/>
+              </w:rPr>
+              <w:t xml:space="preserve">notification_templates.body</w:t>
+            </w:r>
+          </w:p>
+        </w:tc>
+        <w:tc>
+          <w:tcPr>
+            <w:tcW w:type="dxa" w:w="1700"/>
+            <w:tcMar>
+              <w:top w:type="dxa" w:w="60"/>
+              <w:left w:type="dxa" w:w="100"/>
+              <w:bottom w:type="dxa" w:w="60"/>
+              <w:right w:type="dxa" w:w="100"/>
+            </w:tcMar>
+            <w:vAlign w:val="center"/>
+          </w:tcPr>
+          <w:p>
+            <w:r>
+              <w:rPr>
+                <w:b w:val="false"/>
+                <w:bCs w:val="false"/>
+                <w:color w:val="111827"/>
+                <w:sz w:val="19"/>
+                <w:szCs w:val="19"/>
+              </w:rPr>
+              <w:t xml:space="preserve">TEXT</w:t>
+            </w:r>
+          </w:p>
+        </w:tc>
+        <w:tc>
+          <w:tcPr>
+            <w:tcW w:type="dxa" w:w="2160"/>
+            <w:tcMar>
+              <w:top w:type="dxa" w:w="60"/>
+              <w:left w:type="dxa" w:w="100"/>
+              <w:bottom w:type="dxa" w:w="60"/>
+              <w:right w:type="dxa" w:w="100"/>
+            </w:tcMar>
+            <w:vAlign w:val="center"/>
+          </w:tcPr>
+          <w:p>
+            <w:r>
+              <w:rPr>
+                <w:b w:val="false"/>
+                <w:bCs w:val="false"/>
+                <w:color w:val="111827"/>
+                <w:sz w:val="19"/>
+                <w:szCs w:val="19"/>
+              </w:rPr>
+              <w:t xml:space="preserve">NOT NULL</w:t>
+            </w:r>
+          </w:p>
+        </w:tc>
+        <w:tc>
+          <w:tcPr>
+            <w:tcW w:type="dxa" w:w="3800"/>
+            <w:tcMar>
+              <w:top w:type="dxa" w:w="60"/>
+              <w:left w:type="dxa" w:w="100"/>
+              <w:bottom w:type="dxa" w:w="60"/>
+              <w:right w:type="dxa" w:w="100"/>
+            </w:tcMar>
+            <w:vAlign w:val="center"/>
+          </w:tcPr>
+          <w:p>
+            <w:r>
+              <w:rPr>
+                <w:b w:val="false"/>
+                <w:bCs w:val="false"/>
+                <w:color w:val="111827"/>
+                <w:sz w:val="19"/>
+                <w:szCs w:val="19"/>
+              </w:rPr>
+              <w:t xml:space="preserve">Template body with placeholder variables, rendered against notifications.payload</w:t>
+            </w:r>
+          </w:p>
+        </w:tc>
+      </w:tr>
+    </w:tbl>
+    <w:p>
+      <w:pPr>
+        <w:spacing w:after="220"/>
+      </w:pPr>
+    </w:p>
+    <w:p>
+      <w:pPr>
+        <w:spacing w:after="140" w:line="276"/>
+      </w:pPr>
+      <w:r>
+        <w:rPr>
+          <w:b w:val="false"/>
+          <w:bCs w:val="false"/>
+          <w:i w:val="false"/>
+          <w:iCs w:val="false"/>
+          <w:sz w:val="21"/>
+          <w:szCs w:val="21"/>
+        </w:rPr>
+        <w:t xml:space="preserve">notification_preferences (FR-NOTIF-02, Could-priority — supports opt-in/opt-out per channel where policy permits)</w:t>
+      </w:r>
+    </w:p>
+    <w:tbl>
+      <w:tblPr>
+        <w:tblW w:type="dxa" w:w="9360"/>
+        <w:tblBorders>
+          <w:top w:val="single" w:color="auto" w:sz="4"/>
+          <w:left w:val="single" w:color="auto" w:sz="4"/>
+          <w:bottom w:val="single" w:color="auto" w:sz="4"/>
+          <w:right w:val="single" w:color="auto" w:sz="4"/>
+          <w:insideH w:val="single" w:color="auto" w:sz="4"/>
+          <w:insideV w:val="single" w:color="auto" w:sz="4"/>
+        </w:tblBorders>
+      </w:tblPr>
+      <w:tblGrid>
+        <w:gridCol w:w="1700"/>
+        <w:gridCol w:w="1700"/>
+        <w:gridCol w:w="2160"/>
+        <w:gridCol w:w="3800"/>
+      </w:tblGrid>
+      <w:tr>
+        <w:trPr>
+          <w:tblHeader/>
+        </w:trPr>
+        <w:tc>
+          <w:tcPr>
+            <w:tcW w:type="dxa" w:w="1700"/>
+            <w:shd w:fill="1e3a5f" w:val="clear"/>
+            <w:tcMar>
+              <w:top w:type="dxa" w:w="60"/>
+              <w:left w:type="dxa" w:w="100"/>
+              <w:bottom w:type="dxa" w:w="60"/>
+              <w:right w:type="dxa" w:w="100"/>
+            </w:tcMar>
+            <w:vAlign w:val="center"/>
+          </w:tcPr>
+          <w:p>
+            <w:r>
+              <w:rPr>
+                <w:b/>
+                <w:bCs/>
+                <w:color w:val="FFFFFF"/>
+                <w:sz w:val="19"/>
+                <w:szCs w:val="19"/>
+              </w:rPr>
+              <w:t xml:space="preserve">Column</w:t>
+            </w:r>
+          </w:p>
+        </w:tc>
+        <w:tc>
+          <w:tcPr>
+            <w:tcW w:type="dxa" w:w="1700"/>
+            <w:shd w:fill="1e3a5f" w:val="clear"/>
+            <w:tcMar>
+              <w:top w:type="dxa" w:w="60"/>
+              <w:left w:type="dxa" w:w="100"/>
+              <w:bottom w:type="dxa" w:w="60"/>
+              <w:right w:type="dxa" w:w="100"/>
+            </w:tcMar>
+            <w:vAlign w:val="center"/>
+          </w:tcPr>
+          <w:p>
+            <w:r>
+              <w:rPr>
+                <w:b/>
+                <w:bCs/>
+                <w:color w:val="FFFFFF"/>
+                <w:sz w:val="19"/>
+                <w:szCs w:val="19"/>
+              </w:rPr>
+              <w:t xml:space="preserve">Type</w:t>
+            </w:r>
+          </w:p>
+        </w:tc>
+        <w:tc>
+          <w:tcPr>
+            <w:tcW w:type="dxa" w:w="2160"/>
+            <w:shd w:fill="1e3a5f" w:val="clear"/>
+            <w:tcMar>
+              <w:top w:type="dxa" w:w="60"/>
+              <w:left w:type="dxa" w:w="100"/>
+              <w:bottom w:type="dxa" w:w="60"/>
+              <w:right w:type="dxa" w:w="100"/>
+            </w:tcMar>
+            <w:vAlign w:val="center"/>
+          </w:tcPr>
+          <w:p>
+            <w:r>
+              <w:rPr>
+                <w:b/>
+                <w:bCs/>
+                <w:color w:val="FFFFFF"/>
+                <w:sz w:val="19"/>
+                <w:szCs w:val="19"/>
+              </w:rPr>
+              <w:t xml:space="preserve">Constraints</w:t>
+            </w:r>
+          </w:p>
+        </w:tc>
+        <w:tc>
+          <w:tcPr>
+            <w:tcW w:type="dxa" w:w="3800"/>
+            <w:shd w:fill="1e3a5f" w:val="clear"/>
+            <w:tcMar>
+              <w:top w:type="dxa" w:w="60"/>
+              <w:left w:type="dxa" w:w="100"/>
+              <w:bottom w:type="dxa" w:w="60"/>
+              <w:right w:type="dxa" w:w="100"/>
+            </w:tcMar>
+            <w:vAlign w:val="center"/>
+          </w:tcPr>
+          <w:p>
+            <w:r>
+              <w:rPr>
+                <w:b/>
+                <w:bCs/>
+                <w:color w:val="FFFFFF"/>
+                <w:sz w:val="19"/>
+                <w:szCs w:val="19"/>
+              </w:rPr>
+              <w:t xml:space="preserve">Description</w:t>
+            </w:r>
+          </w:p>
+        </w:tc>
+      </w:tr>
+      <w:tr>
+        <w:tc>
+          <w:tcPr>
+            <w:tcW w:type="dxa" w:w="1700"/>
+            <w:tcMar>
+              <w:top w:type="dxa" w:w="60"/>
+              <w:left w:type="dxa" w:w="100"/>
+              <w:bottom w:type="dxa" w:w="60"/>
+              <w:right w:type="dxa" w:w="100"/>
+            </w:tcMar>
+            <w:vAlign w:val="center"/>
+          </w:tcPr>
+          <w:p>
+            <w:r>
+              <w:rPr>
+                <w:b w:val="false"/>
+                <w:bCs w:val="false"/>
+                <w:color w:val="111827"/>
+                <w:sz w:val="19"/>
+                <w:szCs w:val="19"/>
+              </w:rPr>
+              <w:t xml:space="preserve">id</w:t>
+            </w:r>
+          </w:p>
+        </w:tc>
+        <w:tc>
+          <w:tcPr>
+            <w:tcW w:type="dxa" w:w="1700"/>
+            <w:tcMar>
+              <w:top w:type="dxa" w:w="60"/>
+              <w:left w:type="dxa" w:w="100"/>
+              <w:bottom w:type="dxa" w:w="60"/>
+              <w:right w:type="dxa" w:w="100"/>
+            </w:tcMar>
+            <w:vAlign w:val="center"/>
+          </w:tcPr>
+          <w:p>
+            <w:r>
+              <w:rPr>
+                <w:b w:val="false"/>
+                <w:bCs w:val="false"/>
+                <w:color w:val="111827"/>
+                <w:sz w:val="19"/>
+                <w:szCs w:val="19"/>
+              </w:rPr>
+              <w:t xml:space="preserve">SERIAL</w:t>
+            </w:r>
+          </w:p>
+        </w:tc>
+        <w:tc>
+          <w:tcPr>
+            <w:tcW w:type="dxa" w:w="2160"/>
+            <w:tcMar>
+              <w:top w:type="dxa" w:w="60"/>
+              <w:left w:type="dxa" w:w="100"/>
+              <w:bottom w:type="dxa" w:w="60"/>
+              <w:right w:type="dxa" w:w="100"/>
+            </w:tcMar>
+            <w:vAlign w:val="center"/>
+          </w:tcPr>
+          <w:p>
+            <w:r>
+              <w:rPr>
+                <w:b w:val="false"/>
+                <w:bCs w:val="false"/>
+                <w:color w:val="111827"/>
+                <w:sz w:val="19"/>
+                <w:szCs w:val="19"/>
+              </w:rPr>
+              <w:t xml:space="preserve">PK</w:t>
+            </w:r>
+          </w:p>
+        </w:tc>
+        <w:tc>
+          <w:tcPr>
+            <w:tcW w:type="dxa" w:w="3800"/>
+            <w:tcMar>
+              <w:top w:type="dxa" w:w="60"/>
+              <w:left w:type="dxa" w:w="100"/>
+              <w:bottom w:type="dxa" w:w="60"/>
+              <w:right w:type="dxa" w:w="100"/>
+            </w:tcMar>
+            <w:vAlign w:val="center"/>
+          </w:tcPr>
+          <w:p>
+            <w:r>
+              <w:rPr>
+                <w:b w:val="false"/>
+                <w:bCs w:val="false"/>
+                <w:color w:val="111827"/>
+                <w:sz w:val="19"/>
+                <w:szCs w:val="19"/>
+              </w:rPr>
+              <w:t xml:space="preserve">Preference row</w:t>
+            </w:r>
+          </w:p>
+        </w:tc>
+      </w:tr>
+      <w:tr>
+        <w:tc>
+          <w:tcPr>
+            <w:tcW w:type="dxa" w:w="1700"/>
+            <w:shd w:fill="F3F4F6" w:val="clear"/>
+            <w:tcMar>
+              <w:top w:type="dxa" w:w="60"/>
+              <w:left w:type="dxa" w:w="100"/>
+              <w:bottom w:type="dxa" w:w="60"/>
+              <w:right w:type="dxa" w:w="100"/>
+            </w:tcMar>
+            <w:vAlign w:val="center"/>
+          </w:tcPr>
+          <w:p>
+            <w:r>
+              <w:rPr>
+                <w:b w:val="false"/>
+                <w:bCs w:val="false"/>
+                <w:color w:val="111827"/>
+                <w:sz w:val="19"/>
+                <w:szCs w:val="19"/>
+              </w:rPr>
+              <w:t xml:space="preserve">user_id</w:t>
+            </w:r>
+          </w:p>
+        </w:tc>
+        <w:tc>
+          <w:tcPr>
+            <w:tcW w:type="dxa" w:w="1700"/>
+            <w:shd w:fill="F3F4F6" w:val="clear"/>
+            <w:tcMar>
+              <w:top w:type="dxa" w:w="60"/>
+              <w:left w:type="dxa" w:w="100"/>
+              <w:bottom w:type="dxa" w:w="60"/>
+              <w:right w:type="dxa" w:w="100"/>
+            </w:tcMar>
+            <w:vAlign w:val="center"/>
+          </w:tcPr>
+          <w:p>
+            <w:r>
+              <w:rPr>
+                <w:b w:val="false"/>
+                <w:bCs w:val="false"/>
+                <w:color w:val="111827"/>
+                <w:sz w:val="19"/>
+                <w:szCs w:val="19"/>
+              </w:rPr>
+              <w:t xml:space="preserve">UUID</w:t>
+            </w:r>
+          </w:p>
+        </w:tc>
+        <w:tc>
+          <w:tcPr>
+            <w:tcW w:type="dxa" w:w="2160"/>
+            <w:shd w:fill="F3F4F6" w:val="clear"/>
+            <w:tcMar>
+              <w:top w:type="dxa" w:w="60"/>
+              <w:left w:type="dxa" w:w="100"/>
+              <w:bottom w:type="dxa" w:w="60"/>
+              <w:right w:type="dxa" w:w="100"/>
+            </w:tcMar>
+            <w:vAlign w:val="center"/>
+          </w:tcPr>
+          <w:p>
+            <w:r>
+              <w:rPr>
+                <w:b w:val="false"/>
+                <w:bCs w:val="false"/>
+                <w:color w:val="111827"/>
+                <w:sz w:val="19"/>
+                <w:szCs w:val="19"/>
+              </w:rPr>
+              <w:t xml:space="preserve">NOT NULL</w:t>
+            </w:r>
+          </w:p>
+        </w:tc>
+        <w:tc>
+          <w:tcPr>
+            <w:tcW w:type="dxa" w:w="3800"/>
+            <w:shd w:fill="F3F4F6" w:val="clear"/>
+            <w:tcMar>
+              <w:top w:type="dxa" w:w="60"/>
+              <w:left w:type="dxa" w:w="100"/>
+              <w:bottom w:type="dxa" w:w="60"/>
+              <w:right w:type="dxa" w:w="100"/>
+            </w:tcMar>
+            <w:vAlign w:val="center"/>
+          </w:tcPr>
+          <w:p>
+            <w:r>
+              <w:rPr>
+                <w:b w:val="false"/>
+                <w:bCs w:val="false"/>
+                <w:color w:val="111827"/>
+                <w:sz w:val="19"/>
+                <w:szCs w:val="19"/>
+              </w:rPr>
+              <w:t xml:space="preserve">Target user (logical FK → identity_db.users.id)</w:t>
+            </w:r>
+          </w:p>
+        </w:tc>
+      </w:tr>
+      <w:tr>
+        <w:tc>
+          <w:tcPr>
+            <w:tcW w:type="dxa" w:w="1700"/>
+            <w:tcMar>
+              <w:top w:type="dxa" w:w="60"/>
+              <w:left w:type="dxa" w:w="100"/>
+              <w:bottom w:type="dxa" w:w="60"/>
+              <w:right w:type="dxa" w:w="100"/>
+            </w:tcMar>
+            <w:vAlign w:val="center"/>
+          </w:tcPr>
+          <w:p>
+            <w:r>
+              <w:rPr>
+                <w:b w:val="false"/>
+                <w:bCs w:val="false"/>
+                <w:color w:val="111827"/>
+                <w:sz w:val="19"/>
+                <w:szCs w:val="19"/>
+              </w:rPr>
+              <w:t xml:space="preserve">channel</w:t>
+            </w:r>
+          </w:p>
+        </w:tc>
+        <w:tc>
+          <w:tcPr>
+            <w:tcW w:type="dxa" w:w="1700"/>
+            <w:tcMar>
+              <w:top w:type="dxa" w:w="60"/>
+              <w:left w:type="dxa" w:w="100"/>
+              <w:bottom w:type="dxa" w:w="60"/>
+              <w:right w:type="dxa" w:w="100"/>
+            </w:tcMar>
+            <w:vAlign w:val="center"/>
+          </w:tcPr>
+          <w:p>
+            <w:r>
+              <w:rPr>
+                <w:b w:val="false"/>
+                <w:bCs w:val="false"/>
+                <w:color w:val="111827"/>
+                <w:sz w:val="19"/>
+                <w:szCs w:val="19"/>
+              </w:rPr>
+              <w:t xml:space="preserve">VARCHAR(20)</w:t>
+            </w:r>
+          </w:p>
+        </w:tc>
+        <w:tc>
+          <w:tcPr>
+            <w:tcW w:type="dxa" w:w="2160"/>
+            <w:tcMar>
+              <w:top w:type="dxa" w:w="60"/>
+              <w:left w:type="dxa" w:w="100"/>
+              <w:bottom w:type="dxa" w:w="60"/>
+              <w:right w:type="dxa" w:w="100"/>
+            </w:tcMar>
+            <w:vAlign w:val="center"/>
+          </w:tcPr>
+          <w:p>
+            <w:r>
+              <w:rPr>
+                <w:b w:val="false"/>
+                <w:bCs w:val="false"/>
+                <w:color w:val="111827"/>
+                <w:sz w:val="19"/>
+                <w:szCs w:val="19"/>
+              </w:rPr>
+              <w:t xml:space="preserve">NOT NULL, CHECK IN ('email','sms','push','in_app')</w:t>
+            </w:r>
+          </w:p>
+        </w:tc>
+        <w:tc>
+          <w:tcPr>
+            <w:tcW w:type="dxa" w:w="3800"/>
+            <w:tcMar>
+              <w:top w:type="dxa" w:w="60"/>
+              <w:left w:type="dxa" w:w="100"/>
+              <w:bottom w:type="dxa" w:w="60"/>
+              <w:right w:type="dxa" w:w="100"/>
+            </w:tcMar>
+            <w:vAlign w:val="center"/>
+          </w:tcPr>
+          <w:p>
+            <w:r>
+              <w:rPr>
+                <w:b w:val="false"/>
+                <w:bCs w:val="false"/>
+                <w:color w:val="111827"/>
+                <w:sz w:val="19"/>
+                <w:szCs w:val="19"/>
+              </w:rPr>
+              <w:t xml:space="preserve">Channel this preference applies to</w:t>
+            </w:r>
+          </w:p>
+        </w:tc>
+      </w:tr>
+      <w:tr>
+        <w:tc>
+          <w:tcPr>
+            <w:tcW w:type="dxa" w:w="1700"/>
+            <w:shd w:fill="F3F4F6" w:val="clear"/>
+            <w:tcMar>
+              <w:top w:type="dxa" w:w="60"/>
+              <w:left w:type="dxa" w:w="100"/>
+              <w:bottom w:type="dxa" w:w="60"/>
+              <w:right w:type="dxa" w:w="100"/>
+            </w:tcMar>
+            <w:vAlign w:val="center"/>
+          </w:tcPr>
+          <w:p>
+            <w:r>
+              <w:rPr>
+                <w:b w:val="false"/>
+                <w:bCs w:val="false"/>
+                <w:color w:val="111827"/>
+                <w:sz w:val="19"/>
+                <w:szCs w:val="19"/>
+              </w:rPr>
+              <w:t xml:space="preserve">enabled</w:t>
+            </w:r>
+          </w:p>
+        </w:tc>
+        <w:tc>
+          <w:tcPr>
+            <w:tcW w:type="dxa" w:w="1700"/>
+            <w:shd w:fill="F3F4F6" w:val="clear"/>
+            <w:tcMar>
+              <w:top w:type="dxa" w:w="60"/>
+              <w:left w:type="dxa" w:w="100"/>
+              <w:bottom w:type="dxa" w:w="60"/>
+              <w:right w:type="dxa" w:w="100"/>
+            </w:tcMar>
+            <w:vAlign w:val="center"/>
+          </w:tcPr>
+          <w:p>
+            <w:r>
+              <w:rPr>
+                <w:b w:val="false"/>
+                <w:bCs w:val="false"/>
+                <w:color w:val="111827"/>
+                <w:sz w:val="19"/>
+                <w:szCs w:val="19"/>
+              </w:rPr>
+              <w:t xml:space="preserve">BOOLEAN</w:t>
+            </w:r>
+          </w:p>
+        </w:tc>
+        <w:tc>
+          <w:tcPr>
+            <w:tcW w:type="dxa" w:w="2160"/>
+            <w:shd w:fill="F3F4F6" w:val="clear"/>
+            <w:tcMar>
+              <w:top w:type="dxa" w:w="60"/>
+              <w:left w:type="dxa" w:w="100"/>
+              <w:bottom w:type="dxa" w:w="60"/>
+              <w:right w:type="dxa" w:w="100"/>
+            </w:tcMar>
+            <w:vAlign w:val="center"/>
+          </w:tcPr>
+          <w:p>
+            <w:r>
+              <w:rPr>
+                <w:b w:val="false"/>
+                <w:bCs w:val="false"/>
+                <w:color w:val="111827"/>
+                <w:sz w:val="19"/>
+                <w:szCs w:val="19"/>
+              </w:rPr>
+              <w:t xml:space="preserve">NOT NULL, DEFAULT true</w:t>
+            </w:r>
+          </w:p>
+        </w:tc>
+        <w:tc>
+          <w:tcPr>
+            <w:tcW w:type="dxa" w:w="3800"/>
+            <w:shd w:fill="F3F4F6" w:val="clear"/>
+            <w:tcMar>
+              <w:top w:type="dxa" w:w="60"/>
+              <w:left w:type="dxa" w:w="100"/>
+              <w:bottom w:type="dxa" w:w="60"/>
+              <w:right w:type="dxa" w:w="100"/>
+            </w:tcMar>
+            <w:vAlign w:val="center"/>
+          </w:tcPr>
+          <w:p>
+            <w:r>
+              <w:rPr>
+                <w:b w:val="false"/>
+                <w:bCs w:val="false"/>
+                <w:color w:val="111827"/>
+                <w:sz w:val="19"/>
+                <w:szCs w:val="19"/>
+              </w:rPr>
+              <w:t xml:space="preserve">Whether this user receives notifications on this channel</w:t>
             </w:r>
           </w:p>
         </w:tc>

</xml_diff>